<commit_message>
Senaryo Yazarı Sultan UÇAR ALTUN künyesi eklendi
</commit_message>
<xml_diff>
--- a/oyunlar/YEGITEK26BTY05050610_Ekran_Yazilari.docx
+++ b/oyunlar/YEGITEK26BTY05050610_Ekran_Yazilari.docx
@@ -97,6 +97,59 @@
                 <w:sz w:val="20"/>
               </w:rPr>
               <w:t>YEGITEK26BTY05050610</w:t>
+            </w:r>
+          </w:p>
+        </w:tc>
+      </w:tr>
+      <w:tr>
+        <w:tc>
+          <w:tcPr>
+            <w:tcW w:type="dxa" w:w="4824"/>
+            <w:shd w:fill="F8FAFC"/>
+            <w:tcMar>
+              <w:top w:w="80" w:type="dxa"/>
+              <w:bottom w:w="80" w:type="dxa"/>
+              <w:left w:w="120" w:type="dxa"/>
+              <w:right w:w="120" w:type="dxa"/>
+            </w:tcMar>
+          </w:tcPr>
+          <w:p>
+            <w:pPr>
+              <w:spacing w:before="60" w:after="60"/>
+            </w:pPr>
+            <w:r>
+              <w:rPr>
+                <w:rFonts w:ascii="Calibri" w:hAnsi="Calibri"/>
+                <w:b/>
+                <w:color w:val="1E293B"/>
+                <w:sz w:val="20"/>
+              </w:rPr>
+              <w:t>Senaryo Yazarı</w:t>
+            </w:r>
+          </w:p>
+        </w:tc>
+        <w:tc>
+          <w:tcPr>
+            <w:tcW w:type="dxa" w:w="4824"/>
+            <w:shd w:fill="FFFFFF"/>
+            <w:tcMar>
+              <w:top w:w="80" w:type="dxa"/>
+              <w:bottom w:w="80" w:type="dxa"/>
+              <w:left w:w="120" w:type="dxa"/>
+              <w:right w:w="120" w:type="dxa"/>
+            </w:tcMar>
+          </w:tcPr>
+          <w:p>
+            <w:pPr>
+              <w:spacing w:before="60" w:after="60"/>
+            </w:pPr>
+            <w:r>
+              <w:rPr>
+                <w:rFonts w:ascii="Calibri" w:hAnsi="Calibri"/>
+                <w:color w:val="0F172A"/>
+                <w:sz w:val="20"/>
+              </w:rPr>
+              <w:t>Sultan UÇAR ALTUN</w:t>
             </w:r>
           </w:p>
         </w:tc>
@@ -1058,6 +1111,59 @@
                 <w:color w:val="1E293B"/>
                 <w:sz w:val="20"/>
               </w:rPr>
+              <w:t>Alt Bar Yazar Künyesi</w:t>
+            </w:r>
+          </w:p>
+        </w:tc>
+        <w:tc>
+          <w:tcPr>
+            <w:tcW w:type="dxa" w:w="4824"/>
+            <w:shd w:fill="FFFFFF"/>
+            <w:tcMar>
+              <w:top w:w="80" w:type="dxa"/>
+              <w:bottom w:w="80" w:type="dxa"/>
+              <w:left w:w="120" w:type="dxa"/>
+              <w:right w:w="120" w:type="dxa"/>
+            </w:tcMar>
+          </w:tcPr>
+          <w:p>
+            <w:pPr>
+              <w:spacing w:before="60" w:after="60"/>
+            </w:pPr>
+            <w:r>
+              <w:rPr>
+                <w:rFonts w:ascii="Calibri" w:hAnsi="Calibri"/>
+                <w:color w:val="0F172A"/>
+                <w:sz w:val="20"/>
+              </w:rPr>
+              <w:t>Senaryo Yazarı: Sultan UÇAR ALTUN</w:t>
+            </w:r>
+          </w:p>
+        </w:tc>
+      </w:tr>
+      <w:tr>
+        <w:tc>
+          <w:tcPr>
+            <w:tcW w:type="dxa" w:w="4824"/>
+            <w:shd w:fill="F8FAFC"/>
+            <w:tcMar>
+              <w:top w:w="80" w:type="dxa"/>
+              <w:bottom w:w="80" w:type="dxa"/>
+              <w:left w:w="120" w:type="dxa"/>
+              <w:right w:w="120" w:type="dxa"/>
+            </w:tcMar>
+          </w:tcPr>
+          <w:p>
+            <w:pPr>
+              <w:spacing w:before="60" w:after="60"/>
+            </w:pPr>
+            <w:r>
+              <w:rPr>
+                <w:rFonts w:ascii="Calibri" w:hAnsi="Calibri"/>
+                <w:b/>
+                <w:color w:val="1E293B"/>
+                <w:sz w:val="20"/>
+              </w:rPr>
               <w:t>Alt Bar İleri Navigasyon Butonu</w:t>
             </w:r>
           </w:p>
@@ -1276,6 +1382,59 @@
                 <w:sz w:val="20"/>
               </w:rPr>
               <w:t>BİLGİBOT Girdi Avı Oyunu</w:t>
+            </w:r>
+          </w:p>
+        </w:tc>
+      </w:tr>
+      <w:tr>
+        <w:tc>
+          <w:tcPr>
+            <w:tcW w:type="dxa" w:w="4824"/>
+            <w:shd w:fill="F8FAFC"/>
+            <w:tcMar>
+              <w:top w:w="80" w:type="dxa"/>
+              <w:bottom w:w="80" w:type="dxa"/>
+              <w:left w:w="120" w:type="dxa"/>
+              <w:right w:w="120" w:type="dxa"/>
+            </w:tcMar>
+          </w:tcPr>
+          <w:p>
+            <w:pPr>
+              <w:spacing w:before="60" w:after="60"/>
+            </w:pPr>
+            <w:r>
+              <w:rPr>
+                <w:rFonts w:ascii="Calibri" w:hAnsi="Calibri"/>
+                <w:b/>
+                <w:color w:val="1E293B"/>
+                <w:sz w:val="20"/>
+              </w:rPr>
+              <w:t>Senaryo Yazarı Etiketi</w:t>
+            </w:r>
+          </w:p>
+        </w:tc>
+        <w:tc>
+          <w:tcPr>
+            <w:tcW w:type="dxa" w:w="4824"/>
+            <w:shd w:fill="FFFFFF"/>
+            <w:tcMar>
+              <w:top w:w="80" w:type="dxa"/>
+              <w:bottom w:w="80" w:type="dxa"/>
+              <w:left w:w="120" w:type="dxa"/>
+              <w:right w:w="120" w:type="dxa"/>
+            </w:tcMar>
+          </w:tcPr>
+          <w:p>
+            <w:pPr>
+              <w:spacing w:before="60" w:after="60"/>
+            </w:pPr>
+            <w:r>
+              <w:rPr>
+                <w:rFonts w:ascii="Calibri" w:hAnsi="Calibri"/>
+                <w:color w:val="0F172A"/>
+                <w:sz w:val="20"/>
+              </w:rPr>
+              <w:t>Senaryo Yazarı: Sultan UÇAR ALTUN</w:t>
             </w:r>
           </w:p>
         </w:tc>
@@ -7334,6 +7493,59 @@
                 <w:color w:val="1E293B"/>
                 <w:sz w:val="20"/>
               </w:rPr>
+              <w:t>Sertifika Kutusu — Senaryo Yazarı İmzası</w:t>
+            </w:r>
+          </w:p>
+        </w:tc>
+        <w:tc>
+          <w:tcPr>
+            <w:tcW w:type="dxa" w:w="4824"/>
+            <w:shd w:fill="FFFFFF"/>
+            <w:tcMar>
+              <w:top w:w="80" w:type="dxa"/>
+              <w:bottom w:w="80" w:type="dxa"/>
+              <w:left w:w="120" w:type="dxa"/>
+              <w:right w:w="120" w:type="dxa"/>
+            </w:tcMar>
+          </w:tcPr>
+          <w:p>
+            <w:pPr>
+              <w:spacing w:before="60" w:after="60"/>
+            </w:pPr>
+            <w:r>
+              <w:rPr>
+                <w:rFonts w:ascii="Calibri" w:hAnsi="Calibri"/>
+                <w:color w:val="0F172A"/>
+                <w:sz w:val="20"/>
+              </w:rPr>
+              <w:t>Senaryo Yazarı: Sultan UÇAR ALTUN</w:t>
+            </w:r>
+          </w:p>
+        </w:tc>
+      </w:tr>
+      <w:tr>
+        <w:tc>
+          <w:tcPr>
+            <w:tcW w:type="dxa" w:w="4824"/>
+            <w:shd w:fill="F8FAFC"/>
+            <w:tcMar>
+              <w:top w:w="80" w:type="dxa"/>
+              <w:bottom w:w="80" w:type="dxa"/>
+              <w:left w:w="120" w:type="dxa"/>
+              <w:right w:w="120" w:type="dxa"/>
+            </w:tcMar>
+          </w:tcPr>
+          <w:p>
+            <w:pPr>
+              <w:spacing w:before="60" w:after="60"/>
+            </w:pPr>
+            <w:r>
+              <w:rPr>
+                <w:rFonts w:ascii="Calibri" w:hAnsi="Calibri"/>
+                <w:b/>
+                <w:color w:val="1E293B"/>
+                <w:sz w:val="20"/>
+              </w:rPr>
               <w:t>Tekrar Oynama Butonu Metni</w:t>
             </w:r>
           </w:p>

</xml_diff>

<commit_message>
Senaryo künyesi ve metaverileri zenginleştirildi
</commit_message>
<xml_diff>
--- a/oyunlar/YEGITEK26BTY05050610_Ekran_Yazilari.docx
+++ b/oyunlar/YEGITEK26BTY05050610_Ekran_Yazilari.docx
@@ -71,7 +71,7 @@
                 <w:color w:val="1E293B"/>
                 <w:sz w:val="20"/>
               </w:rPr>
-              <w:t>Senaryo Kodu</w:t>
+              <w:t>İçerik Kodu</w:t>
             </w:r>
           </w:p>
         </w:tc>
@@ -97,6 +97,59 @@
                 <w:sz w:val="20"/>
               </w:rPr>
               <w:t>YEGITEK26BTY05050610</w:t>
+            </w:r>
+          </w:p>
+        </w:tc>
+      </w:tr>
+      <w:tr>
+        <w:tc>
+          <w:tcPr>
+            <w:tcW w:type="dxa" w:w="4824"/>
+            <w:shd w:fill="F8FAFC"/>
+            <w:tcMar>
+              <w:top w:w="80" w:type="dxa"/>
+              <w:bottom w:w="80" w:type="dxa"/>
+              <w:left w:w="120" w:type="dxa"/>
+              <w:right w:w="120" w:type="dxa"/>
+            </w:tcMar>
+          </w:tcPr>
+          <w:p>
+            <w:pPr>
+              <w:spacing w:before="60" w:after="60"/>
+            </w:pPr>
+            <w:r>
+              <w:rPr>
+                <w:rFonts w:ascii="Calibri" w:hAnsi="Calibri"/>
+                <w:b/>
+                <w:color w:val="1E293B"/>
+                <w:sz w:val="20"/>
+              </w:rPr>
+              <w:t>Senaryo Başlığı</w:t>
+            </w:r>
+          </w:p>
+        </w:tc>
+        <w:tc>
+          <w:tcPr>
+            <w:tcW w:type="dxa" w:w="4824"/>
+            <w:shd w:fill="FFFFFF"/>
+            <w:tcMar>
+              <w:top w:w="80" w:type="dxa"/>
+              <w:bottom w:w="80" w:type="dxa"/>
+              <w:left w:w="120" w:type="dxa"/>
+              <w:right w:w="120" w:type="dxa"/>
+            </w:tcMar>
+          </w:tcPr>
+          <w:p>
+            <w:pPr>
+              <w:spacing w:before="60" w:after="60"/>
+            </w:pPr>
+            <w:r>
+              <w:rPr>
+                <w:rFonts w:ascii="Calibri" w:hAnsi="Calibri"/>
+                <w:color w:val="0F172A"/>
+                <w:sz w:val="20"/>
+              </w:rPr>
+              <w:t>Yapay Zekâ Girdileri</w:t>
             </w:r>
           </w:p>
         </w:tc>
@@ -177,7 +230,7 @@
                 <w:color w:val="1E293B"/>
                 <w:sz w:val="20"/>
               </w:rPr>
-              <w:t>Kazanım / Konu</w:t>
+              <w:t>Ders ve Sınıf Düzeyi</w:t>
             </w:r>
           </w:p>
         </w:tc>
@@ -202,7 +255,166 @@
                 <w:color w:val="0F172A"/>
                 <w:sz w:val="20"/>
               </w:rPr>
-              <w:t>BTY.6.5.1. Yapay Zekâ Girdileri</w:t>
+              <w:t>Bilişim Teknolojileri ve Yazılım — 6. Sınıf</w:t>
+            </w:r>
+          </w:p>
+        </w:tc>
+      </w:tr>
+      <w:tr>
+        <w:tc>
+          <w:tcPr>
+            <w:tcW w:type="dxa" w:w="4824"/>
+            <w:shd w:fill="F8FAFC"/>
+            <w:tcMar>
+              <w:top w:w="80" w:type="dxa"/>
+              <w:bottom w:w="80" w:type="dxa"/>
+              <w:left w:w="120" w:type="dxa"/>
+              <w:right w:w="120" w:type="dxa"/>
+            </w:tcMar>
+          </w:tcPr>
+          <w:p>
+            <w:pPr>
+              <w:spacing w:before="60" w:after="60"/>
+            </w:pPr>
+            <w:r>
+              <w:rPr>
+                <w:rFonts w:ascii="Calibri" w:hAnsi="Calibri"/>
+                <w:b/>
+                <w:color w:val="1E293B"/>
+                <w:sz w:val="20"/>
+              </w:rPr>
+              <w:t>Tema</w:t>
+            </w:r>
+          </w:p>
+        </w:tc>
+        <w:tc>
+          <w:tcPr>
+            <w:tcW w:type="dxa" w:w="4824"/>
+            <w:shd w:fill="FFFFFF"/>
+            <w:tcMar>
+              <w:top w:w="80" w:type="dxa"/>
+              <w:bottom w:w="80" w:type="dxa"/>
+              <w:left w:w="120" w:type="dxa"/>
+              <w:right w:w="120" w:type="dxa"/>
+            </w:tcMar>
+          </w:tcPr>
+          <w:p>
+            <w:pPr>
+              <w:spacing w:before="60" w:after="60"/>
+            </w:pPr>
+            <w:r>
+              <w:rPr>
+                <w:rFonts w:ascii="Calibri" w:hAnsi="Calibri"/>
+                <w:color w:val="0F172A"/>
+                <w:sz w:val="20"/>
+              </w:rPr>
+              <w:t>5. Tema: Yapay Zekâ</w:t>
+            </w:r>
+          </w:p>
+        </w:tc>
+      </w:tr>
+      <w:tr>
+        <w:tc>
+          <w:tcPr>
+            <w:tcW w:type="dxa" w:w="4824"/>
+            <w:shd w:fill="F8FAFC"/>
+            <w:tcMar>
+              <w:top w:w="80" w:type="dxa"/>
+              <w:bottom w:w="80" w:type="dxa"/>
+              <w:left w:w="120" w:type="dxa"/>
+              <w:right w:w="120" w:type="dxa"/>
+            </w:tcMar>
+          </w:tcPr>
+          <w:p>
+            <w:pPr>
+              <w:spacing w:before="60" w:after="60"/>
+            </w:pPr>
+            <w:r>
+              <w:rPr>
+                <w:rFonts w:ascii="Calibri" w:hAnsi="Calibri"/>
+                <w:b/>
+                <w:color w:val="1E293B"/>
+                <w:sz w:val="20"/>
+              </w:rPr>
+              <w:t>Alt Öğrenme Alanı</w:t>
+            </w:r>
+          </w:p>
+        </w:tc>
+        <w:tc>
+          <w:tcPr>
+            <w:tcW w:type="dxa" w:w="4824"/>
+            <w:shd w:fill="FFFFFF"/>
+            <w:tcMar>
+              <w:top w:w="80" w:type="dxa"/>
+              <w:bottom w:w="80" w:type="dxa"/>
+              <w:left w:w="120" w:type="dxa"/>
+              <w:right w:w="120" w:type="dxa"/>
+            </w:tcMar>
+          </w:tcPr>
+          <w:p>
+            <w:pPr>
+              <w:spacing w:before="60" w:after="60"/>
+            </w:pPr>
+            <w:r>
+              <w:rPr>
+                <w:rFonts w:ascii="Calibri" w:hAnsi="Calibri"/>
+                <w:color w:val="0F172A"/>
+                <w:sz w:val="20"/>
+              </w:rPr>
+              <w:t>Yapay zekâ girdileri hakkında bilgi toplayabilme</w:t>
+            </w:r>
+          </w:p>
+        </w:tc>
+      </w:tr>
+      <w:tr>
+        <w:tc>
+          <w:tcPr>
+            <w:tcW w:type="dxa" w:w="4824"/>
+            <w:shd w:fill="F8FAFC"/>
+            <w:tcMar>
+              <w:top w:w="80" w:type="dxa"/>
+              <w:bottom w:w="80" w:type="dxa"/>
+              <w:left w:w="120" w:type="dxa"/>
+              <w:right w:w="120" w:type="dxa"/>
+            </w:tcMar>
+          </w:tcPr>
+          <w:p>
+            <w:pPr>
+              <w:spacing w:before="60" w:after="60"/>
+            </w:pPr>
+            <w:r>
+              <w:rPr>
+                <w:rFonts w:ascii="Calibri" w:hAnsi="Calibri"/>
+                <w:b/>
+                <w:color w:val="1E293B"/>
+                <w:sz w:val="20"/>
+              </w:rPr>
+              <w:t>Kazanım</w:t>
+            </w:r>
+          </w:p>
+        </w:tc>
+        <w:tc>
+          <w:tcPr>
+            <w:tcW w:type="dxa" w:w="4824"/>
+            <w:shd w:fill="FFFFFF"/>
+            <w:tcMar>
+              <w:top w:w="80" w:type="dxa"/>
+              <w:bottom w:w="80" w:type="dxa"/>
+              <w:left w:w="120" w:type="dxa"/>
+              <w:right w:w="120" w:type="dxa"/>
+            </w:tcMar>
+          </w:tcPr>
+          <w:p>
+            <w:pPr>
+              <w:spacing w:before="60" w:after="60"/>
+            </w:pPr>
+            <w:r>
+              <w:rPr>
+                <w:rFonts w:ascii="Calibri" w:hAnsi="Calibri"/>
+                <w:color w:val="0F172A"/>
+                <w:sz w:val="20"/>
+              </w:rPr>
+              <w:t>BTY.6.5.1. Yapay zekâ girdileri hakkında bilgi toplayabilme (a. Araç belirleme, b. Bilgi bulma)</w:t>
             </w:r>
           </w:p>
         </w:tc>

</xml_diff>

<commit_message>
MEB uyumlu Vercel linki eklendi
</commit_message>
<xml_diff>
--- a/oyunlar/YEGITEK26BTY05050610_Ekran_Yazilari.docx
+++ b/oyunlar/YEGITEK26BTY05050610_Ekran_Yazilari.docx
@@ -468,6 +468,59 @@
                 <w:sz w:val="20"/>
               </w:rPr>
               <w:t>Girdi Avcısı Robot — BİLGİBOT Veri Yakalama Oyunu</w:t>
+            </w:r>
+          </w:p>
+        </w:tc>
+      </w:tr>
+      <w:tr>
+        <w:tc>
+          <w:tcPr>
+            <w:tcW w:type="dxa" w:w="4824"/>
+            <w:shd w:fill="F8FAFC"/>
+            <w:tcMar>
+              <w:top w:w="80" w:type="dxa"/>
+              <w:bottom w:w="80" w:type="dxa"/>
+              <w:left w:w="120" w:type="dxa"/>
+              <w:right w:w="120" w:type="dxa"/>
+            </w:tcMar>
+          </w:tcPr>
+          <w:p>
+            <w:pPr>
+              <w:spacing w:before="60" w:after="60"/>
+            </w:pPr>
+            <w:r>
+              <w:rPr>
+                <w:rFonts w:ascii="Calibri" w:hAnsi="Calibri"/>
+                <w:b/>
+                <w:color w:val="1E293B"/>
+                <w:sz w:val="20"/>
+              </w:rPr>
+              <w:t>Canlı Oyun Bağlantısı (MEB Uyumlu)</w:t>
+            </w:r>
+          </w:p>
+        </w:tc>
+        <w:tc>
+          <w:tcPr>
+            <w:tcW w:type="dxa" w:w="4824"/>
+            <w:shd w:fill="FFFFFF"/>
+            <w:tcMar>
+              <w:top w:w="80" w:type="dxa"/>
+              <w:bottom w:w="80" w:type="dxa"/>
+              <w:left w:w="120" w:type="dxa"/>
+              <w:right w:w="120" w:type="dxa"/>
+            </w:tcMar>
+          </w:tcPr>
+          <w:p>
+            <w:pPr>
+              <w:spacing w:before="60" w:after="60"/>
+            </w:pPr>
+            <w:r>
+              <w:rPr>
+                <w:rFonts w:ascii="Calibri" w:hAnsi="Calibri"/>
+                <w:color w:val="0F172A"/>
+                <w:sz w:val="20"/>
+              </w:rPr>
+              <w:t>https://etkilesimliicerikler.vercel.app/oyunlar/yegitek26bty05050610-yapayzekagirdileri.html</w:t>
             </w:r>
           </w:p>
         </w:tc>

</xml_diff>

<commit_message>
Revize: 3 serit secim mekanigi, bolum basi 2 hata hakki, dogru cevaplar paneli, 3-1/3-2/3-3 bolumleme, yazar adi kaldirildi
</commit_message>
<xml_diff>
--- a/oyunlar/YEGITEK26BTY05050610_Ekran_Yazilari.docx
+++ b/oyunlar/YEGITEK26BTY05050610_Ekran_Yazilari.docx
@@ -150,59 +150,6 @@
                 <w:sz w:val="20"/>
               </w:rPr>
               <w:t>Yapay Zekâ Girdileri</w:t>
-            </w:r>
-          </w:p>
-        </w:tc>
-      </w:tr>
-      <w:tr>
-        <w:tc>
-          <w:tcPr>
-            <w:tcW w:type="dxa" w:w="4824"/>
-            <w:shd w:fill="F8FAFC"/>
-            <w:tcMar>
-              <w:top w:w="80" w:type="dxa"/>
-              <w:bottom w:w="80" w:type="dxa"/>
-              <w:left w:w="120" w:type="dxa"/>
-              <w:right w:w="120" w:type="dxa"/>
-            </w:tcMar>
-          </w:tcPr>
-          <w:p>
-            <w:pPr>
-              <w:spacing w:before="60" w:after="60"/>
-            </w:pPr>
-            <w:r>
-              <w:rPr>
-                <w:rFonts w:ascii="Calibri" w:hAnsi="Calibri"/>
-                <w:b/>
-                <w:color w:val="1E293B"/>
-                <w:sz w:val="20"/>
-              </w:rPr>
-              <w:t>Senaryo Yazarı</w:t>
-            </w:r>
-          </w:p>
-        </w:tc>
-        <w:tc>
-          <w:tcPr>
-            <w:tcW w:type="dxa" w:w="4824"/>
-            <w:shd w:fill="FFFFFF"/>
-            <w:tcMar>
-              <w:top w:w="80" w:type="dxa"/>
-              <w:bottom w:w="80" w:type="dxa"/>
-              <w:left w:w="120" w:type="dxa"/>
-              <w:right w:w="120" w:type="dxa"/>
-            </w:tcMar>
-          </w:tcPr>
-          <w:p>
-            <w:pPr>
-              <w:spacing w:before="60" w:after="60"/>
-            </w:pPr>
-            <w:r>
-              <w:rPr>
-                <w:rFonts w:ascii="Calibri" w:hAnsi="Calibri"/>
-                <w:color w:val="0F172A"/>
-                <w:sz w:val="20"/>
-              </w:rPr>
-              <w:t>Sultan UÇAR ALTUN</w:t>
             </w:r>
           </w:p>
         </w:tc>
@@ -871,7 +818,7 @@
                 <w:color w:val="0F172A"/>
                 <w:sz w:val="20"/>
               </w:rPr>
-              <w:t>Laboratuvar Puanı:</w:t>
+              <w:t>Puan:</w:t>
             </w:r>
           </w:p>
         </w:tc>
@@ -924,7 +871,7 @@
                 <w:color w:val="0F172A"/>
                 <w:sz w:val="20"/>
               </w:rPr>
-              <w:t>0</w:t>
+              <w:t>0 / 100</w:t>
             </w:r>
           </w:p>
         </w:tc>
@@ -1376,59 +1323,6 @@
                 <w:color w:val="1E293B"/>
                 <w:sz w:val="20"/>
               </w:rPr>
-              <w:t>Alt Bar Yazar Künyesi</w:t>
-            </w:r>
-          </w:p>
-        </w:tc>
-        <w:tc>
-          <w:tcPr>
-            <w:tcW w:type="dxa" w:w="4824"/>
-            <w:shd w:fill="FFFFFF"/>
-            <w:tcMar>
-              <w:top w:w="80" w:type="dxa"/>
-              <w:bottom w:w="80" w:type="dxa"/>
-              <w:left w:w="120" w:type="dxa"/>
-              <w:right w:w="120" w:type="dxa"/>
-            </w:tcMar>
-          </w:tcPr>
-          <w:p>
-            <w:pPr>
-              <w:spacing w:before="60" w:after="60"/>
-            </w:pPr>
-            <w:r>
-              <w:rPr>
-                <w:rFonts w:ascii="Calibri" w:hAnsi="Calibri"/>
-                <w:color w:val="0F172A"/>
-                <w:sz w:val="20"/>
-              </w:rPr>
-              <w:t>Senaryo Yazarı: Sultan UÇAR ALTUN</w:t>
-            </w:r>
-          </w:p>
-        </w:tc>
-      </w:tr>
-      <w:tr>
-        <w:tc>
-          <w:tcPr>
-            <w:tcW w:type="dxa" w:w="4824"/>
-            <w:shd w:fill="F8FAFC"/>
-            <w:tcMar>
-              <w:top w:w="80" w:type="dxa"/>
-              <w:bottom w:w="80" w:type="dxa"/>
-              <w:left w:w="120" w:type="dxa"/>
-              <w:right w:w="120" w:type="dxa"/>
-            </w:tcMar>
-          </w:tcPr>
-          <w:p>
-            <w:pPr>
-              <w:spacing w:before="60" w:after="60"/>
-            </w:pPr>
-            <w:r>
-              <w:rPr>
-                <w:rFonts w:ascii="Calibri" w:hAnsi="Calibri"/>
-                <w:b/>
-                <w:color w:val="1E293B"/>
-                <w:sz w:val="20"/>
-              </w:rPr>
               <w:t>Alt Bar İleri Navigasyon Butonu</w:t>
             </w:r>
           </w:p>
@@ -1674,59 +1568,6 @@
                 <w:color w:val="1E293B"/>
                 <w:sz w:val="20"/>
               </w:rPr>
-              <w:t>Senaryo Yazarı Etiketi</w:t>
-            </w:r>
-          </w:p>
-        </w:tc>
-        <w:tc>
-          <w:tcPr>
-            <w:tcW w:type="dxa" w:w="4824"/>
-            <w:shd w:fill="FFFFFF"/>
-            <w:tcMar>
-              <w:top w:w="80" w:type="dxa"/>
-              <w:bottom w:w="80" w:type="dxa"/>
-              <w:left w:w="120" w:type="dxa"/>
-              <w:right w:w="120" w:type="dxa"/>
-            </w:tcMar>
-          </w:tcPr>
-          <w:p>
-            <w:pPr>
-              <w:spacing w:before="60" w:after="60"/>
-            </w:pPr>
-            <w:r>
-              <w:rPr>
-                <w:rFonts w:ascii="Calibri" w:hAnsi="Calibri"/>
-                <w:color w:val="0F172A"/>
-                <w:sz w:val="20"/>
-              </w:rPr>
-              <w:t>Senaryo Yazarı: Sultan UÇAR ALTUN</w:t>
-            </w:r>
-          </w:p>
-        </w:tc>
-      </w:tr>
-      <w:tr>
-        <w:tc>
-          <w:tcPr>
-            <w:tcW w:type="dxa" w:w="4824"/>
-            <w:shd w:fill="F8FAFC"/>
-            <w:tcMar>
-              <w:top w:w="80" w:type="dxa"/>
-              <w:bottom w:w="80" w:type="dxa"/>
-              <w:left w:w="120" w:type="dxa"/>
-              <w:right w:w="120" w:type="dxa"/>
-            </w:tcMar>
-          </w:tcPr>
-          <w:p>
-            <w:pPr>
-              <w:spacing w:before="60" w:after="60"/>
-            </w:pPr>
-            <w:r>
-              <w:rPr>
-                <w:rFonts w:ascii="Calibri" w:hAnsi="Calibri"/>
-                <w:b/>
-                <w:color w:val="1E293B"/>
-                <w:sz w:val="20"/>
-              </w:rPr>
               <w:t>İllüstrasyon İçi Örnek Kapsül Metni</w:t>
             </w:r>
           </w:p>
@@ -1911,7 +1752,7 @@
                 <w:color w:val="0F172A"/>
                 <w:sz w:val="20"/>
               </w:rPr>
-              <w:t>2. Bölüm (Kaliteli Girdi Avı): Net ifadeleri, doğru etiketleri ve güncel verileri yakalayarak modeli 500.000 veriye ulaştırınız; kusurlu verilerden kaçınız!</w:t>
+              <w:t>2. Bölüm (Kaliteli Girdi Avı): Net ifadeleri, doğru etiketleri ve güncel verileri yakalayarak yapay zekâ modelini eğitiniz; kusurlu verilerden kaçınız!</w:t>
             </w:r>
           </w:p>
         </w:tc>
@@ -2633,7 +2474,7 @@
                 <w:color w:val="0F172A"/>
                 <w:sz w:val="20"/>
               </w:rPr>
-              <w:t>✨ +15 PUAN! ✨</w:t>
+              <w:t>✨ DOĞRU GİRDİ! ✨</w:t>
             </w:r>
           </w:p>
         </w:tc>
@@ -2979,7 +2820,7 @@
                 <w:color w:val="1E293B"/>
                 <w:sz w:val="20"/>
               </w:rPr>
-              <w:t>2. Bölüm Alt Sayaç Şablonu</w:t>
+              <w:t>2. Bölüm Alt İbre Metni</w:t>
             </w:r>
           </w:p>
         </w:tc>
@@ -3004,7 +2845,7 @@
                 <w:color w:val="0F172A"/>
                 <w:sz w:val="20"/>
               </w:rPr>
-              <w:t>Toplanan Kaliteli Veri: [Sayı] / 5</w:t>
+              <w:t>Model Durumu: Kaliteli Veriler Toplanıyor</w:t>
             </w:r>
           </w:p>
         </w:tc>
@@ -3032,7 +2873,7 @@
                 <w:color w:val="1E293B"/>
                 <w:sz w:val="20"/>
               </w:rPr>
-              <w:t>2. Bölüm Model Başarı İbresi Şablonu</w:t>
+              <w:t>2. Bölüm Alt Sayaç Şablonu</w:t>
             </w:r>
           </w:p>
         </w:tc>
@@ -3057,60 +2898,7 @@
                 <w:color w:val="0F172A"/>
                 <w:sz w:val="20"/>
               </w:rPr>
-              <w:t>Model Durumu: [Veri Sayısı] Veri (%[Yüzde] Başarı)</w:t>
-            </w:r>
-          </w:p>
-        </w:tc>
-      </w:tr>
-      <w:tr>
-        <w:tc>
-          <w:tcPr>
-            <w:tcW w:type="dxa" w:w="4824"/>
-            <w:shd w:fill="F8FAFC"/>
-            <w:tcMar>
-              <w:top w:w="80" w:type="dxa"/>
-              <w:bottom w:w="80" w:type="dxa"/>
-              <w:left w:w="120" w:type="dxa"/>
-              <w:right w:w="120" w:type="dxa"/>
-            </w:tcMar>
-          </w:tcPr>
-          <w:p>
-            <w:pPr>
-              <w:spacing w:before="60" w:after="60"/>
-            </w:pPr>
-            <w:r>
-              <w:rPr>
-                <w:rFonts w:ascii="Calibri" w:hAnsi="Calibri"/>
-                <w:b/>
-                <w:color w:val="1E293B"/>
-                <w:sz w:val="20"/>
-              </w:rPr>
-              <w:t>2. Bölüm Başlangıç İbresi</w:t>
-            </w:r>
-          </w:p>
-        </w:tc>
-        <w:tc>
-          <w:tcPr>
-            <w:tcW w:type="dxa" w:w="4824"/>
-            <w:shd w:fill="FFFFFF"/>
-            <w:tcMar>
-              <w:top w:w="80" w:type="dxa"/>
-              <w:bottom w:w="80" w:type="dxa"/>
-              <w:left w:w="120" w:type="dxa"/>
-              <w:right w:w="120" w:type="dxa"/>
-            </w:tcMar>
-          </w:tcPr>
-          <w:p>
-            <w:pPr>
-              <w:spacing w:before="60" w:after="60"/>
-            </w:pPr>
-            <w:r>
-              <w:rPr>
-                <w:rFonts w:ascii="Calibri" w:hAnsi="Calibri"/>
-                <w:color w:val="0F172A"/>
-                <w:sz w:val="20"/>
-              </w:rPr>
-              <w:t>Model Durumu: 100.000 Veri (%35 Başarı)</w:t>
+              <w:t>Toplanan Kaliteli Veri: [Sayı] / 5</w:t>
             </w:r>
           </w:p>
         </w:tc>
@@ -7518,7 +7306,7 @@
                 <w:color w:val="0F172A"/>
                 <w:sz w:val="20"/>
               </w:rPr>
-              <w:t>Toplam Skorunuz: [Puan] (Kazanılan Yıldız: [Yıldız Sayısı] / 3)</w:t>
+              <w:t>Toplam Skorunuz: [Puan] / 100 (Kazanılan Yıldız: [Yıldız Sayısı] / 3)</w:t>
             </w:r>
           </w:p>
         </w:tc>
@@ -7677,7 +7465,7 @@
                 <w:color w:val="0F172A"/>
                 <w:sz w:val="20"/>
               </w:rPr>
-              <w:t>Etkili Girdi: Net ifadeleri, doğru etiketleri ve güncel verileri toplayarak modeli 500.000 veriye ulaştırdınız.</w:t>
+              <w:t>Etkili Girdi: Net ifadeleri, doğru etiketleri ve güncel verileri toplayarak yapay zekâ modelini başarıyla eğittiniz.</w:t>
             </w:r>
           </w:p>
         </w:tc>
@@ -7731,59 +7519,6 @@
                 <w:sz w:val="20"/>
               </w:rPr>
               <w:t>Günlük Hayat: Yemek malzemesi, navigasyon adresi, müzik geçmişi ve klavye harflerini başarıyla ayırt ettiniz.</w:t>
-            </w:r>
-          </w:p>
-        </w:tc>
-      </w:tr>
-      <w:tr>
-        <w:tc>
-          <w:tcPr>
-            <w:tcW w:type="dxa" w:w="4824"/>
-            <w:shd w:fill="F8FAFC"/>
-            <w:tcMar>
-              <w:top w:w="80" w:type="dxa"/>
-              <w:bottom w:w="80" w:type="dxa"/>
-              <w:left w:w="120" w:type="dxa"/>
-              <w:right w:w="120" w:type="dxa"/>
-            </w:tcMar>
-          </w:tcPr>
-          <w:p>
-            <w:pPr>
-              <w:spacing w:before="60" w:after="60"/>
-            </w:pPr>
-            <w:r>
-              <w:rPr>
-                <w:rFonts w:ascii="Calibri" w:hAnsi="Calibri"/>
-                <w:b/>
-                <w:color w:val="1E293B"/>
-                <w:sz w:val="20"/>
-              </w:rPr>
-              <w:t>Sertifika Kutusu — Senaryo Yazarı İmzası</w:t>
-            </w:r>
-          </w:p>
-        </w:tc>
-        <w:tc>
-          <w:tcPr>
-            <w:tcW w:type="dxa" w:w="4824"/>
-            <w:shd w:fill="FFFFFF"/>
-            <w:tcMar>
-              <w:top w:w="80" w:type="dxa"/>
-              <w:bottom w:w="80" w:type="dxa"/>
-              <w:left w:w="120" w:type="dxa"/>
-              <w:right w:w="120" w:type="dxa"/>
-            </w:tcMar>
-          </w:tcPr>
-          <w:p>
-            <w:pPr>
-              <w:spacing w:before="60" w:after="60"/>
-            </w:pPr>
-            <w:r>
-              <w:rPr>
-                <w:rFonts w:ascii="Calibri" w:hAnsi="Calibri"/>
-                <w:color w:val="0F172A"/>
-                <w:sz w:val="20"/>
-              </w:rPr>
-              <w:t>Senaryo Yazarı: Sultan UÇAR ALTUN</w:t>
             </w:r>
           </w:p>
         </w:tc>

</xml_diff>

<commit_message>
Revize: Alt bilgi seridi (Kalan Hedef ve Girdi Turleri Avi satiri) tamamen kaldirildi
</commit_message>
<xml_diff>
--- a/oyunlar/YEGITEK26BTY05050610_Ekran_Yazilari.docx
+++ b/oyunlar/YEGITEK26BTY05050610_Ekran_Yazilari.docx
@@ -2687,324 +2687,6 @@
                 <w:sz w:val="20"/>
               </w:rPr>
               <w:t>Tebrikler! Bölüm Görevini Başarıyla Tamamladınız. 'İleri' butonuna basınız.</w:t>
-            </w:r>
-          </w:p>
-        </w:tc>
-      </w:tr>
-      <w:tr>
-        <w:tc>
-          <w:tcPr>
-            <w:tcW w:type="dxa" w:w="4824"/>
-            <w:shd w:fill="F8FAFC"/>
-            <w:tcMar>
-              <w:top w:w="80" w:type="dxa"/>
-              <w:bottom w:w="80" w:type="dxa"/>
-              <w:left w:w="120" w:type="dxa"/>
-              <w:right w:w="120" w:type="dxa"/>
-            </w:tcMar>
-          </w:tcPr>
-          <w:p>
-            <w:pPr>
-              <w:spacing w:before="60" w:after="60"/>
-            </w:pPr>
-            <w:r>
-              <w:rPr>
-                <w:rFonts w:ascii="Calibri" w:hAnsi="Calibri"/>
-                <w:b/>
-                <w:color w:val="1E293B"/>
-                <w:sz w:val="20"/>
-              </w:rPr>
-              <w:t>1. Bölüm Alt İbre Metni</w:t>
-            </w:r>
-          </w:p>
-        </w:tc>
-        <w:tc>
-          <w:tcPr>
-            <w:tcW w:type="dxa" w:w="4824"/>
-            <w:shd w:fill="FFFFFF"/>
-            <w:tcMar>
-              <w:top w:w="80" w:type="dxa"/>
-              <w:bottom w:w="80" w:type="dxa"/>
-              <w:left w:w="120" w:type="dxa"/>
-              <w:right w:w="120" w:type="dxa"/>
-            </w:tcMar>
-          </w:tcPr>
-          <w:p>
-            <w:pPr>
-              <w:spacing w:before="60" w:after="60"/>
-            </w:pPr>
-            <w:r>
-              <w:rPr>
-                <w:rFonts w:ascii="Calibri" w:hAnsi="Calibri"/>
-                <w:color w:val="0F172A"/>
-                <w:sz w:val="20"/>
-              </w:rPr>
-              <w:t>Girdi Türleri Avı</w:t>
-            </w:r>
-          </w:p>
-        </w:tc>
-      </w:tr>
-      <w:tr>
-        <w:tc>
-          <w:tcPr>
-            <w:tcW w:type="dxa" w:w="4824"/>
-            <w:shd w:fill="F8FAFC"/>
-            <w:tcMar>
-              <w:top w:w="80" w:type="dxa"/>
-              <w:bottom w:w="80" w:type="dxa"/>
-              <w:left w:w="120" w:type="dxa"/>
-              <w:right w:w="120" w:type="dxa"/>
-            </w:tcMar>
-          </w:tcPr>
-          <w:p>
-            <w:pPr>
-              <w:spacing w:before="60" w:after="60"/>
-            </w:pPr>
-            <w:r>
-              <w:rPr>
-                <w:rFonts w:ascii="Calibri" w:hAnsi="Calibri"/>
-                <w:b/>
-                <w:color w:val="1E293B"/>
-                <w:sz w:val="20"/>
-              </w:rPr>
-              <w:t>1. Bölüm Alt Sayaç Şablonu</w:t>
-            </w:r>
-          </w:p>
-        </w:tc>
-        <w:tc>
-          <w:tcPr>
-            <w:tcW w:type="dxa" w:w="4824"/>
-            <w:shd w:fill="FFFFFF"/>
-            <w:tcMar>
-              <w:top w:w="80" w:type="dxa"/>
-              <w:bottom w:w="80" w:type="dxa"/>
-              <w:left w:w="120" w:type="dxa"/>
-              <w:right w:w="120" w:type="dxa"/>
-            </w:tcMar>
-          </w:tcPr>
-          <w:p>
-            <w:pPr>
-              <w:spacing w:before="60" w:after="60"/>
-            </w:pPr>
-            <w:r>
-              <w:rPr>
-                <w:rFonts w:ascii="Calibri" w:hAnsi="Calibri"/>
-                <w:color w:val="0F172A"/>
-                <w:sz w:val="20"/>
-              </w:rPr>
-              <w:t>Kalan Hedef: [Sayı]</w:t>
-            </w:r>
-          </w:p>
-        </w:tc>
-      </w:tr>
-      <w:tr>
-        <w:tc>
-          <w:tcPr>
-            <w:tcW w:type="dxa" w:w="4824"/>
-            <w:shd w:fill="F8FAFC"/>
-            <w:tcMar>
-              <w:top w:w="80" w:type="dxa"/>
-              <w:bottom w:w="80" w:type="dxa"/>
-              <w:left w:w="120" w:type="dxa"/>
-              <w:right w:w="120" w:type="dxa"/>
-            </w:tcMar>
-          </w:tcPr>
-          <w:p>
-            <w:pPr>
-              <w:spacing w:before="60" w:after="60"/>
-            </w:pPr>
-            <w:r>
-              <w:rPr>
-                <w:rFonts w:ascii="Calibri" w:hAnsi="Calibri"/>
-                <w:b/>
-                <w:color w:val="1E293B"/>
-                <w:sz w:val="20"/>
-              </w:rPr>
-              <w:t>2. Bölüm Alt İbre Metni</w:t>
-            </w:r>
-          </w:p>
-        </w:tc>
-        <w:tc>
-          <w:tcPr>
-            <w:tcW w:type="dxa" w:w="4824"/>
-            <w:shd w:fill="FFFFFF"/>
-            <w:tcMar>
-              <w:top w:w="80" w:type="dxa"/>
-              <w:bottom w:w="80" w:type="dxa"/>
-              <w:left w:w="120" w:type="dxa"/>
-              <w:right w:w="120" w:type="dxa"/>
-            </w:tcMar>
-          </w:tcPr>
-          <w:p>
-            <w:pPr>
-              <w:spacing w:before="60" w:after="60"/>
-            </w:pPr>
-            <w:r>
-              <w:rPr>
-                <w:rFonts w:ascii="Calibri" w:hAnsi="Calibri"/>
-                <w:color w:val="0F172A"/>
-                <w:sz w:val="20"/>
-              </w:rPr>
-              <w:t>Model Durumu: Kaliteli Veriler Toplanıyor</w:t>
-            </w:r>
-          </w:p>
-        </w:tc>
-      </w:tr>
-      <w:tr>
-        <w:tc>
-          <w:tcPr>
-            <w:tcW w:type="dxa" w:w="4824"/>
-            <w:shd w:fill="F8FAFC"/>
-            <w:tcMar>
-              <w:top w:w="80" w:type="dxa"/>
-              <w:bottom w:w="80" w:type="dxa"/>
-              <w:left w:w="120" w:type="dxa"/>
-              <w:right w:w="120" w:type="dxa"/>
-            </w:tcMar>
-          </w:tcPr>
-          <w:p>
-            <w:pPr>
-              <w:spacing w:before="60" w:after="60"/>
-            </w:pPr>
-            <w:r>
-              <w:rPr>
-                <w:rFonts w:ascii="Calibri" w:hAnsi="Calibri"/>
-                <w:b/>
-                <w:color w:val="1E293B"/>
-                <w:sz w:val="20"/>
-              </w:rPr>
-              <w:t>2. Bölüm Alt Sayaç Şablonu</w:t>
-            </w:r>
-          </w:p>
-        </w:tc>
-        <w:tc>
-          <w:tcPr>
-            <w:tcW w:type="dxa" w:w="4824"/>
-            <w:shd w:fill="FFFFFF"/>
-            <w:tcMar>
-              <w:top w:w="80" w:type="dxa"/>
-              <w:bottom w:w="80" w:type="dxa"/>
-              <w:left w:w="120" w:type="dxa"/>
-              <w:right w:w="120" w:type="dxa"/>
-            </w:tcMar>
-          </w:tcPr>
-          <w:p>
-            <w:pPr>
-              <w:spacing w:before="60" w:after="60"/>
-            </w:pPr>
-            <w:r>
-              <w:rPr>
-                <w:rFonts w:ascii="Calibri" w:hAnsi="Calibri"/>
-                <w:color w:val="0F172A"/>
-                <w:sz w:val="20"/>
-              </w:rPr>
-              <w:t>Toplanan Kaliteli Veri: [Sayı] / 5</w:t>
-            </w:r>
-          </w:p>
-        </w:tc>
-      </w:tr>
-      <w:tr>
-        <w:tc>
-          <w:tcPr>
-            <w:tcW w:type="dxa" w:w="4824"/>
-            <w:shd w:fill="F8FAFC"/>
-            <w:tcMar>
-              <w:top w:w="80" w:type="dxa"/>
-              <w:bottom w:w="80" w:type="dxa"/>
-              <w:left w:w="120" w:type="dxa"/>
-              <w:right w:w="120" w:type="dxa"/>
-            </w:tcMar>
-          </w:tcPr>
-          <w:p>
-            <w:pPr>
-              <w:spacing w:before="60" w:after="60"/>
-            </w:pPr>
-            <w:r>
-              <w:rPr>
-                <w:rFonts w:ascii="Calibri" w:hAnsi="Calibri"/>
-                <w:b/>
-                <w:color w:val="1E293B"/>
-                <w:sz w:val="20"/>
-              </w:rPr>
-              <w:t>3. Bölüm Alt İbre Metni</w:t>
-            </w:r>
-          </w:p>
-        </w:tc>
-        <w:tc>
-          <w:tcPr>
-            <w:tcW w:type="dxa" w:w="4824"/>
-            <w:shd w:fill="FFFFFF"/>
-            <w:tcMar>
-              <w:top w:w="80" w:type="dxa"/>
-              <w:bottom w:w="80" w:type="dxa"/>
-              <w:left w:w="120" w:type="dxa"/>
-              <w:right w:w="120" w:type="dxa"/>
-            </w:tcMar>
-          </w:tcPr>
-          <w:p>
-            <w:pPr>
-              <w:spacing w:before="60" w:after="60"/>
-            </w:pPr>
-            <w:r>
-              <w:rPr>
-                <w:rFonts w:ascii="Calibri" w:hAnsi="Calibri"/>
-                <w:color w:val="0F172A"/>
-                <w:sz w:val="20"/>
-              </w:rPr>
-              <w:t>Günlük Hayat Girdi Metaforları</w:t>
-            </w:r>
-          </w:p>
-        </w:tc>
-      </w:tr>
-      <w:tr>
-        <w:tc>
-          <w:tcPr>
-            <w:tcW w:type="dxa" w:w="4824"/>
-            <w:shd w:fill="F8FAFC"/>
-            <w:tcMar>
-              <w:top w:w="80" w:type="dxa"/>
-              <w:bottom w:w="80" w:type="dxa"/>
-              <w:left w:w="120" w:type="dxa"/>
-              <w:right w:w="120" w:type="dxa"/>
-            </w:tcMar>
-          </w:tcPr>
-          <w:p>
-            <w:pPr>
-              <w:spacing w:before="60" w:after="60"/>
-            </w:pPr>
-            <w:r>
-              <w:rPr>
-                <w:rFonts w:ascii="Calibri" w:hAnsi="Calibri"/>
-                <w:b/>
-                <w:color w:val="1E293B"/>
-                <w:sz w:val="20"/>
-              </w:rPr>
-              <w:t>3. Bölüm Alt Sayaç Şablonu</w:t>
-            </w:r>
-          </w:p>
-        </w:tc>
-        <w:tc>
-          <w:tcPr>
-            <w:tcW w:type="dxa" w:w="4824"/>
-            <w:shd w:fill="FFFFFF"/>
-            <w:tcMar>
-              <w:top w:w="80" w:type="dxa"/>
-              <w:bottom w:w="80" w:type="dxa"/>
-              <w:left w:w="120" w:type="dxa"/>
-              <w:right w:w="120" w:type="dxa"/>
-            </w:tcMar>
-          </w:tcPr>
-          <w:p>
-            <w:pPr>
-              <w:spacing w:before="60" w:after="60"/>
-            </w:pPr>
-            <w:r>
-              <w:rPr>
-                <w:rFonts w:ascii="Calibri" w:hAnsi="Calibri"/>
-                <w:color w:val="0F172A"/>
-                <w:sz w:val="20"/>
-              </w:rPr>
-              <w:t>Kalan Günlük Hayat Girdisi: [Sayı]</w:t>
             </w:r>
           </w:p>
         </w:tc>

</xml_diff>

<commit_message>
fix(girdi-avcisi): oyun başlığı 'Girdi Avcısı' yapıldı, üst bar sadeleştirildi, kalp solma mekanizması güncellendi
</commit_message>
<xml_diff>
--- a/oyunlar/YEGITEK26BTY05050610_Ekran_Yazilari.docx
+++ b/oyunlar/YEGITEK26BTY05050610_Ekran_Yazilari.docx
@@ -414,7 +414,7 @@
                 <w:color w:val="0F172A"/>
                 <w:sz w:val="20"/>
               </w:rPr>
-              <w:t>Girdi Avcısı Robot — BİLGİBOT Veri Yakalama Oyunu</w:t>
+              <w:t>Girdi Avcısı — BİLGİBOT Veri Yakalama Oyunu</w:t>
             </w:r>
           </w:p>
         </w:tc>
@@ -712,7 +712,7 @@
                 <w:color w:val="0F172A"/>
                 <w:sz w:val="20"/>
               </w:rPr>
-              <w:t>Girdi Avcısı Robot — BİLGİBOT Veri Yakalama Oyunu</w:t>
+              <w:t>Girdi Avcısı — BİLGİBOT Veri Yakalama Oyunu</w:t>
             </w:r>
           </w:p>
         </w:tc>
@@ -765,7 +765,113 @@
                 <w:color w:val="0F172A"/>
                 <w:sz w:val="20"/>
               </w:rPr>
-              <w:t>Girdi Avcısı Robot</w:t>
+              <w:t>Girdi Avcısı</w:t>
+            </w:r>
+          </w:p>
+        </w:tc>
+      </w:tr>
+      <w:tr>
+        <w:tc>
+          <w:tcPr>
+            <w:tcW w:type="dxa" w:w="4824"/>
+            <w:shd w:fill="F8FAFC"/>
+            <w:tcMar>
+              <w:top w:w="80" w:type="dxa"/>
+              <w:bottom w:w="80" w:type="dxa"/>
+              <w:left w:w="120" w:type="dxa"/>
+              <w:right w:w="120" w:type="dxa"/>
+            </w:tcMar>
+          </w:tcPr>
+          <w:p>
+            <w:pPr>
+              <w:spacing w:before="60" w:after="60"/>
+            </w:pPr>
+            <w:r>
+              <w:rPr>
+                <w:rFonts w:ascii="Calibri" w:hAnsi="Calibri"/>
+                <w:b/>
+                <w:color w:val="1E293B"/>
+                <w:sz w:val="20"/>
+              </w:rPr>
+              <w:t>Hak Göstergesi Etiketi</w:t>
+            </w:r>
+          </w:p>
+        </w:tc>
+        <w:tc>
+          <w:tcPr>
+            <w:tcW w:type="dxa" w:w="4824"/>
+            <w:shd w:fill="FFFFFF"/>
+            <w:tcMar>
+              <w:top w:w="80" w:type="dxa"/>
+              <w:bottom w:w="80" w:type="dxa"/>
+              <w:left w:w="120" w:type="dxa"/>
+              <w:right w:w="120" w:type="dxa"/>
+            </w:tcMar>
+          </w:tcPr>
+          <w:p>
+            <w:pPr>
+              <w:spacing w:before="60" w:after="60"/>
+            </w:pPr>
+            <w:r>
+              <w:rPr>
+                <w:rFonts w:ascii="Calibri" w:hAnsi="Calibri"/>
+                <w:color w:val="0F172A"/>
+                <w:sz w:val="20"/>
+              </w:rPr>
+              <w:t>Hak:</w:t>
+            </w:r>
+          </w:p>
+        </w:tc>
+      </w:tr>
+      <w:tr>
+        <w:tc>
+          <w:tcPr>
+            <w:tcW w:type="dxa" w:w="4824"/>
+            <w:shd w:fill="F8FAFC"/>
+            <w:tcMar>
+              <w:top w:w="80" w:type="dxa"/>
+              <w:bottom w:w="80" w:type="dxa"/>
+              <w:left w:w="120" w:type="dxa"/>
+              <w:right w:w="120" w:type="dxa"/>
+            </w:tcMar>
+          </w:tcPr>
+          <w:p>
+            <w:pPr>
+              <w:spacing w:before="60" w:after="60"/>
+            </w:pPr>
+            <w:r>
+              <w:rPr>
+                <w:rFonts w:ascii="Calibri" w:hAnsi="Calibri"/>
+                <w:b/>
+                <w:color w:val="1E293B"/>
+                <w:sz w:val="20"/>
+              </w:rPr>
+              <w:t>Hak Göstergesi (Bölüm Başı 2 Hak)</w:t>
+            </w:r>
+          </w:p>
+        </w:tc>
+        <w:tc>
+          <w:tcPr>
+            <w:tcW w:type="dxa" w:w="4824"/>
+            <w:shd w:fill="FFFFFF"/>
+            <w:tcMar>
+              <w:top w:w="80" w:type="dxa"/>
+              <w:bottom w:w="80" w:type="dxa"/>
+              <w:left w:w="120" w:type="dxa"/>
+              <w:right w:w="120" w:type="dxa"/>
+            </w:tcMar>
+          </w:tcPr>
+          <w:p>
+            <w:pPr>
+              <w:spacing w:before="60" w:after="60"/>
+            </w:pPr>
+            <w:r>
+              <w:rPr>
+                <w:rFonts w:ascii="Calibri" w:hAnsi="Calibri"/>
+                <w:color w:val="0F172A"/>
+                <w:sz w:val="20"/>
+              </w:rPr>
+              <w:t>❤️❤️ (2 Kırmızı Kalp / Hata durumunda kırmızı soluklaşır)</w:t>
             </w:r>
           </w:p>
         </w:tc>
@@ -872,59 +978,6 @@
                 <w:sz w:val="20"/>
               </w:rPr>
               <w:t>0 / 100</w:t>
-            </w:r>
-          </w:p>
-        </w:tc>
-      </w:tr>
-      <w:tr>
-        <w:tc>
-          <w:tcPr>
-            <w:tcW w:type="dxa" w:w="4824"/>
-            <w:shd w:fill="F8FAFC"/>
-            <w:tcMar>
-              <w:top w:w="80" w:type="dxa"/>
-              <w:bottom w:w="80" w:type="dxa"/>
-              <w:left w:w="120" w:type="dxa"/>
-              <w:right w:w="120" w:type="dxa"/>
-            </w:tcMar>
-          </w:tcPr>
-          <w:p>
-            <w:pPr>
-              <w:spacing w:before="60" w:after="60"/>
-            </w:pPr>
-            <w:r>
-              <w:rPr>
-                <w:rFonts w:ascii="Calibri" w:hAnsi="Calibri"/>
-                <w:b/>
-                <w:color w:val="1E293B"/>
-                <w:sz w:val="20"/>
-              </w:rPr>
-              <w:t>Yıldız Sayacı Başlangıç Metni</w:t>
-            </w:r>
-          </w:p>
-        </w:tc>
-        <w:tc>
-          <w:tcPr>
-            <w:tcW w:type="dxa" w:w="4824"/>
-            <w:shd w:fill="FFFFFF"/>
-            <w:tcMar>
-              <w:top w:w="80" w:type="dxa"/>
-              <w:bottom w:w="80" w:type="dxa"/>
-              <w:left w:w="120" w:type="dxa"/>
-              <w:right w:w="120" w:type="dxa"/>
-            </w:tcMar>
-          </w:tcPr>
-          <w:p>
-            <w:pPr>
-              <w:spacing w:before="60" w:after="60"/>
-            </w:pPr>
-            <w:r>
-              <w:rPr>
-                <w:rFonts w:ascii="Calibri" w:hAnsi="Calibri"/>
-                <w:color w:val="0F172A"/>
-                <w:sz w:val="20"/>
-              </w:rPr>
-              <w:t>0 / 3</w:t>
             </w:r>
           </w:p>
         </w:tc>
@@ -2050,7 +2103,7 @@
                 <w:color w:val="0F172A"/>
                 <w:sz w:val="20"/>
               </w:rPr>
-              <w:t>Bölüm 1 / 3</w:t>
+              <w:t>Bölüm 3-1 (1 / 3)</w:t>
             </w:r>
           </w:p>
         </w:tc>
@@ -2103,7 +2156,7 @@
                 <w:color w:val="0F172A"/>
                 <w:sz w:val="20"/>
               </w:rPr>
-              <w:t>Bölüm 2 / 3</w:t>
+              <w:t>Bölüm 3-2 (2 / 3)</w:t>
             </w:r>
           </w:p>
         </w:tc>
@@ -2156,7 +2209,7 @@
                 <w:color w:val="0F172A"/>
                 <w:sz w:val="20"/>
               </w:rPr>
-              <w:t>Bölüm 3 / 3</w:t>
+              <w:t>Bölüm 3-3 (3 / 3)</w:t>
             </w:r>
           </w:p>
         </w:tc>

</xml_diff>

<commit_message>
fix(cevap-modal): hata modalı metni güncellendi, ipucu/ampul notu kaldırıldı, bölüm geçişinde dönüt temizlendi
</commit_message>
<xml_diff>
--- a/oyunlar/YEGITEK26BTY05050610_Ekran_Yazilari.docx
+++ b/oyunlar/YEGITEK26BTY05050610_Ekran_Yazilari.docx
@@ -2687,6 +2687,218 @@
                 <w:sz w:val="20"/>
               </w:rPr>
               <w:t>✗ DİKKAT!</w:t>
+            </w:r>
+          </w:p>
+        </w:tc>
+      </w:tr>
+      <w:tr>
+        <w:tc>
+          <w:tcPr>
+            <w:tcW w:type="dxa" w:w="4824"/>
+            <w:shd w:fill="F8FAFC"/>
+            <w:tcMar>
+              <w:top w:w="80" w:type="dxa"/>
+              <w:bottom w:w="80" w:type="dxa"/>
+              <w:left w:w="120" w:type="dxa"/>
+              <w:right w:w="120" w:type="dxa"/>
+            </w:tcMar>
+          </w:tcPr>
+          <w:p>
+            <w:pPr>
+              <w:spacing w:before="60" w:after="60"/>
+            </w:pPr>
+            <w:r>
+              <w:rPr>
+                <w:rFonts w:ascii="Calibri" w:hAnsi="Calibri"/>
+                <w:b/>
+                <w:color w:val="1E293B"/>
+                <w:sz w:val="20"/>
+              </w:rPr>
+              <w:t>2 Yanlış Hakkı Dolduğunda Alt Dönüt</w:t>
+            </w:r>
+          </w:p>
+        </w:tc>
+        <w:tc>
+          <w:tcPr>
+            <w:tcW w:type="dxa" w:w="4824"/>
+            <w:shd w:fill="FFFFFF"/>
+            <w:tcMar>
+              <w:top w:w="80" w:type="dxa"/>
+              <w:bottom w:w="80" w:type="dxa"/>
+              <w:left w:w="120" w:type="dxa"/>
+              <w:right w:w="120" w:type="dxa"/>
+            </w:tcMar>
+          </w:tcPr>
+          <w:p>
+            <w:pPr>
+              <w:spacing w:before="60" w:after="60"/>
+            </w:pPr>
+            <w:r>
+              <w:rPr>
+                <w:rFonts w:ascii="Calibri" w:hAnsi="Calibri"/>
+                <w:color w:val="0F172A"/>
+                <w:sz w:val="20"/>
+              </w:rPr>
+              <w:t>✗ 2 Yanlış Hakkınız Doldu!</w:t>
+            </w:r>
+          </w:p>
+        </w:tc>
+      </w:tr>
+      <w:tr>
+        <w:tc>
+          <w:tcPr>
+            <w:tcW w:type="dxa" w:w="4824"/>
+            <w:shd w:fill="F8FAFC"/>
+            <w:tcMar>
+              <w:top w:w="80" w:type="dxa"/>
+              <w:bottom w:w="80" w:type="dxa"/>
+              <w:left w:w="120" w:type="dxa"/>
+              <w:right w:w="120" w:type="dxa"/>
+            </w:tcMar>
+          </w:tcPr>
+          <w:p>
+            <w:pPr>
+              <w:spacing w:before="60" w:after="60"/>
+            </w:pPr>
+            <w:r>
+              <w:rPr>
+                <w:rFonts w:ascii="Calibri" w:hAnsi="Calibri"/>
+                <w:b/>
+                <w:color w:val="1E293B"/>
+                <w:sz w:val="20"/>
+              </w:rPr>
+              <w:t>2 Yanlış Modalı Başlığı</w:t>
+            </w:r>
+          </w:p>
+        </w:tc>
+        <w:tc>
+          <w:tcPr>
+            <w:tcW w:type="dxa" w:w="4824"/>
+            <w:shd w:fill="FFFFFF"/>
+            <w:tcMar>
+              <w:top w:w="80" w:type="dxa"/>
+              <w:bottom w:w="80" w:type="dxa"/>
+              <w:left w:w="120" w:type="dxa"/>
+              <w:right w:w="120" w:type="dxa"/>
+            </w:tcMar>
+          </w:tcPr>
+          <w:p>
+            <w:pPr>
+              <w:spacing w:before="60" w:after="60"/>
+            </w:pPr>
+            <w:r>
+              <w:rPr>
+                <w:rFonts w:ascii="Calibri" w:hAnsi="Calibri"/>
+                <w:color w:val="0F172A"/>
+                <w:sz w:val="20"/>
+              </w:rPr>
+              <w:t>2 Yanlış Hakkınız Doldu!</w:t>
+            </w:r>
+          </w:p>
+        </w:tc>
+      </w:tr>
+      <w:tr>
+        <w:tc>
+          <w:tcPr>
+            <w:tcW w:type="dxa" w:w="4824"/>
+            <w:shd w:fill="F8FAFC"/>
+            <w:tcMar>
+              <w:top w:w="80" w:type="dxa"/>
+              <w:bottom w:w="80" w:type="dxa"/>
+              <w:left w:w="120" w:type="dxa"/>
+              <w:right w:w="120" w:type="dxa"/>
+            </w:tcMar>
+          </w:tcPr>
+          <w:p>
+            <w:pPr>
+              <w:spacing w:before="60" w:after="60"/>
+            </w:pPr>
+            <w:r>
+              <w:rPr>
+                <w:rFonts w:ascii="Calibri" w:hAnsi="Calibri"/>
+                <w:b/>
+                <w:color w:val="1E293B"/>
+                <w:sz w:val="20"/>
+              </w:rPr>
+              <w:t>2 Yanlış Modalı Yönergesi</w:t>
+            </w:r>
+          </w:p>
+        </w:tc>
+        <w:tc>
+          <w:tcPr>
+            <w:tcW w:type="dxa" w:w="4824"/>
+            <w:shd w:fill="FFFFFF"/>
+            <w:tcMar>
+              <w:top w:w="80" w:type="dxa"/>
+              <w:bottom w:w="80" w:type="dxa"/>
+              <w:left w:w="120" w:type="dxa"/>
+              <w:right w:w="120" w:type="dxa"/>
+            </w:tcMar>
+          </w:tcPr>
+          <w:p>
+            <w:pPr>
+              <w:spacing w:before="60" w:after="60"/>
+            </w:pPr>
+            <w:r>
+              <w:rPr>
+                <w:rFonts w:ascii="Calibri" w:hAnsi="Calibri"/>
+                <w:color w:val="0F172A"/>
+                <w:sz w:val="20"/>
+              </w:rPr>
+              <w:t>Konuyu daha iyi kavramak için bu bölümün doğru cevaplarını inceleyiniz:</w:t>
+            </w:r>
+          </w:p>
+        </w:tc>
+      </w:tr>
+      <w:tr>
+        <w:tc>
+          <w:tcPr>
+            <w:tcW w:type="dxa" w:w="4824"/>
+            <w:shd w:fill="F8FAFC"/>
+            <w:tcMar>
+              <w:top w:w="80" w:type="dxa"/>
+              <w:bottom w:w="80" w:type="dxa"/>
+              <w:left w:w="120" w:type="dxa"/>
+              <w:right w:w="120" w:type="dxa"/>
+            </w:tcMar>
+          </w:tcPr>
+          <w:p>
+            <w:pPr>
+              <w:spacing w:before="60" w:after="60"/>
+            </w:pPr>
+            <w:r>
+              <w:rPr>
+                <w:rFonts w:ascii="Calibri" w:hAnsi="Calibri"/>
+                <w:b/>
+                <w:color w:val="1E293B"/>
+                <w:sz w:val="20"/>
+              </w:rPr>
+              <w:t>2 Yanlış Modalı Geçiş Butonu</w:t>
+            </w:r>
+          </w:p>
+        </w:tc>
+        <w:tc>
+          <w:tcPr>
+            <w:tcW w:type="dxa" w:w="4824"/>
+            <w:shd w:fill="FFFFFF"/>
+            <w:tcMar>
+              <w:top w:w="80" w:type="dxa"/>
+              <w:bottom w:w="80" w:type="dxa"/>
+              <w:left w:w="120" w:type="dxa"/>
+              <w:right w:w="120" w:type="dxa"/>
+            </w:tcMar>
+          </w:tcPr>
+          <w:p>
+            <w:pPr>
+              <w:spacing w:before="60" w:after="60"/>
+            </w:pPr>
+            <w:r>
+              <w:rPr>
+                <w:rFonts w:ascii="Calibri" w:hAnsi="Calibri"/>
+                <w:color w:val="0F172A"/>
+                <w:sz w:val="20"/>
+              </w:rPr>
+              <w:t>Sonraki Bölüme Geç / Sonuç Ekranına Geç</w:t>
             </w:r>
           </w:p>
         </w:tc>

</xml_diff>

<commit_message>
feat(tam-ekran): sağ üst köşeye tam ekran (ekranı kapla) butonu eklendi
</commit_message>
<xml_diff>
--- a/oyunlar/YEGITEK26BTY05050610_Ekran_Yazilari.docx
+++ b/oyunlar/YEGITEK26BTY05050610_Ekran_Yazilari.docx
@@ -1296,6 +1296,218 @@
                 <w:sz w:val="20"/>
               </w:rPr>
               <w:t>Sesi açınız</w:t>
+            </w:r>
+          </w:p>
+        </w:tc>
+      </w:tr>
+      <w:tr>
+        <w:tc>
+          <w:tcPr>
+            <w:tcW w:type="dxa" w:w="4824"/>
+            <w:shd w:fill="F8FAFC"/>
+            <w:tcMar>
+              <w:top w:w="80" w:type="dxa"/>
+              <w:bottom w:w="80" w:type="dxa"/>
+              <w:left w:w="120" w:type="dxa"/>
+              <w:right w:w="120" w:type="dxa"/>
+            </w:tcMar>
+          </w:tcPr>
+          <w:p>
+            <w:pPr>
+              <w:spacing w:before="60" w:after="60"/>
+            </w:pPr>
+            <w:r>
+              <w:rPr>
+                <w:rFonts w:ascii="Calibri" w:hAnsi="Calibri"/>
+                <w:b/>
+                <w:color w:val="1E293B"/>
+                <w:sz w:val="20"/>
+              </w:rPr>
+              <w:t>Tam Ekran Butonu Erişilebilirlik Etiketi (Normal Mod)</w:t>
+            </w:r>
+          </w:p>
+        </w:tc>
+        <w:tc>
+          <w:tcPr>
+            <w:tcW w:type="dxa" w:w="4824"/>
+            <w:shd w:fill="FFFFFF"/>
+            <w:tcMar>
+              <w:top w:w="80" w:type="dxa"/>
+              <w:bottom w:w="80" w:type="dxa"/>
+              <w:left w:w="120" w:type="dxa"/>
+              <w:right w:w="120" w:type="dxa"/>
+            </w:tcMar>
+          </w:tcPr>
+          <w:p>
+            <w:pPr>
+              <w:spacing w:before="60" w:after="60"/>
+            </w:pPr>
+            <w:r>
+              <w:rPr>
+                <w:rFonts w:ascii="Calibri" w:hAnsi="Calibri"/>
+                <w:color w:val="0F172A"/>
+                <w:sz w:val="20"/>
+              </w:rPr>
+              <w:t>Ekranı kaplayınız</w:t>
+            </w:r>
+          </w:p>
+        </w:tc>
+      </w:tr>
+      <w:tr>
+        <w:tc>
+          <w:tcPr>
+            <w:tcW w:type="dxa" w:w="4824"/>
+            <w:shd w:fill="F8FAFC"/>
+            <w:tcMar>
+              <w:top w:w="80" w:type="dxa"/>
+              <w:bottom w:w="80" w:type="dxa"/>
+              <w:left w:w="120" w:type="dxa"/>
+              <w:right w:w="120" w:type="dxa"/>
+            </w:tcMar>
+          </w:tcPr>
+          <w:p>
+            <w:pPr>
+              <w:spacing w:before="60" w:after="60"/>
+            </w:pPr>
+            <w:r>
+              <w:rPr>
+                <w:rFonts w:ascii="Calibri" w:hAnsi="Calibri"/>
+                <w:b/>
+                <w:color w:val="1E293B"/>
+                <w:sz w:val="20"/>
+              </w:rPr>
+              <w:t>Tam Ekran Butonu İpucu (Title - Normal Mod)</w:t>
+            </w:r>
+          </w:p>
+        </w:tc>
+        <w:tc>
+          <w:tcPr>
+            <w:tcW w:type="dxa" w:w="4824"/>
+            <w:shd w:fill="FFFFFF"/>
+            <w:tcMar>
+              <w:top w:w="80" w:type="dxa"/>
+              <w:bottom w:w="80" w:type="dxa"/>
+              <w:left w:w="120" w:type="dxa"/>
+              <w:right w:w="120" w:type="dxa"/>
+            </w:tcMar>
+          </w:tcPr>
+          <w:p>
+            <w:pPr>
+              <w:spacing w:before="60" w:after="60"/>
+            </w:pPr>
+            <w:r>
+              <w:rPr>
+                <w:rFonts w:ascii="Calibri" w:hAnsi="Calibri"/>
+                <w:color w:val="0F172A"/>
+                <w:sz w:val="20"/>
+              </w:rPr>
+              <w:t>Ekranı Kapla</w:t>
+            </w:r>
+          </w:p>
+        </w:tc>
+      </w:tr>
+      <w:tr>
+        <w:tc>
+          <w:tcPr>
+            <w:tcW w:type="dxa" w:w="4824"/>
+            <w:shd w:fill="F8FAFC"/>
+            <w:tcMar>
+              <w:top w:w="80" w:type="dxa"/>
+              <w:bottom w:w="80" w:type="dxa"/>
+              <w:left w:w="120" w:type="dxa"/>
+              <w:right w:w="120" w:type="dxa"/>
+            </w:tcMar>
+          </w:tcPr>
+          <w:p>
+            <w:pPr>
+              <w:spacing w:before="60" w:after="60"/>
+            </w:pPr>
+            <w:r>
+              <w:rPr>
+                <w:rFonts w:ascii="Calibri" w:hAnsi="Calibri"/>
+                <w:b/>
+                <w:color w:val="1E293B"/>
+                <w:sz w:val="20"/>
+              </w:rPr>
+              <w:t>Tam Ekran Butonu Erişilebilirlik Etiketi (Tam Ekran Modu)</w:t>
+            </w:r>
+          </w:p>
+        </w:tc>
+        <w:tc>
+          <w:tcPr>
+            <w:tcW w:type="dxa" w:w="4824"/>
+            <w:shd w:fill="FFFFFF"/>
+            <w:tcMar>
+              <w:top w:w="80" w:type="dxa"/>
+              <w:bottom w:w="80" w:type="dxa"/>
+              <w:left w:w="120" w:type="dxa"/>
+              <w:right w:w="120" w:type="dxa"/>
+            </w:tcMar>
+          </w:tcPr>
+          <w:p>
+            <w:pPr>
+              <w:spacing w:before="60" w:after="60"/>
+            </w:pPr>
+            <w:r>
+              <w:rPr>
+                <w:rFonts w:ascii="Calibri" w:hAnsi="Calibri"/>
+                <w:color w:val="0F172A"/>
+                <w:sz w:val="20"/>
+              </w:rPr>
+              <w:t>Tam ekrandan çıkınız</w:t>
+            </w:r>
+          </w:p>
+        </w:tc>
+      </w:tr>
+      <w:tr>
+        <w:tc>
+          <w:tcPr>
+            <w:tcW w:type="dxa" w:w="4824"/>
+            <w:shd w:fill="F8FAFC"/>
+            <w:tcMar>
+              <w:top w:w="80" w:type="dxa"/>
+              <w:bottom w:w="80" w:type="dxa"/>
+              <w:left w:w="120" w:type="dxa"/>
+              <w:right w:w="120" w:type="dxa"/>
+            </w:tcMar>
+          </w:tcPr>
+          <w:p>
+            <w:pPr>
+              <w:spacing w:before="60" w:after="60"/>
+            </w:pPr>
+            <w:r>
+              <w:rPr>
+                <w:rFonts w:ascii="Calibri" w:hAnsi="Calibri"/>
+                <w:b/>
+                <w:color w:val="1E293B"/>
+                <w:sz w:val="20"/>
+              </w:rPr>
+              <w:t>Tam Ekran Butonu İpucu (Title - Tam Ekran Modu)</w:t>
+            </w:r>
+          </w:p>
+        </w:tc>
+        <w:tc>
+          <w:tcPr>
+            <w:tcW w:type="dxa" w:w="4824"/>
+            <w:shd w:fill="FFFFFF"/>
+            <w:tcMar>
+              <w:top w:w="80" w:type="dxa"/>
+              <w:bottom w:w="80" w:type="dxa"/>
+              <w:left w:w="120" w:type="dxa"/>
+              <w:right w:w="120" w:type="dxa"/>
+            </w:tcMar>
+          </w:tcPr>
+          <w:p>
+            <w:pPr>
+              <w:spacing w:before="60" w:after="60"/>
+            </w:pPr>
+            <w:r>
+              <w:rPr>
+                <w:rFonts w:ascii="Calibri" w:hAnsi="Calibri"/>
+                <w:color w:val="0F172A"/>
+                <w:sz w:val="20"/>
+              </w:rPr>
+              <w:t>Tam Ekrandan Çık</w:t>
             </w:r>
           </w:p>
         </w:tc>

</xml_diff>

<commit_message>
revert(hak): 2 hak ve hata modalı sistemi kaldırılarak revize öncesi serbest deneme-öğrenme akışına dönüldü
</commit_message>
<xml_diff>
--- a/oyunlar/YEGITEK26BTY05050610_Ekran_Yazilari.docx
+++ b/oyunlar/YEGITEK26BTY05050610_Ekran_Yazilari.docx
@@ -766,112 +766,6 @@
                 <w:sz w:val="20"/>
               </w:rPr>
               <w:t>Girdi Avcısı</w:t>
-            </w:r>
-          </w:p>
-        </w:tc>
-      </w:tr>
-      <w:tr>
-        <w:tc>
-          <w:tcPr>
-            <w:tcW w:type="dxa" w:w="4824"/>
-            <w:shd w:fill="F8FAFC"/>
-            <w:tcMar>
-              <w:top w:w="80" w:type="dxa"/>
-              <w:bottom w:w="80" w:type="dxa"/>
-              <w:left w:w="120" w:type="dxa"/>
-              <w:right w:w="120" w:type="dxa"/>
-            </w:tcMar>
-          </w:tcPr>
-          <w:p>
-            <w:pPr>
-              <w:spacing w:before="60" w:after="60"/>
-            </w:pPr>
-            <w:r>
-              <w:rPr>
-                <w:rFonts w:ascii="Calibri" w:hAnsi="Calibri"/>
-                <w:b/>
-                <w:color w:val="1E293B"/>
-                <w:sz w:val="20"/>
-              </w:rPr>
-              <w:t>Hak Göstergesi Etiketi</w:t>
-            </w:r>
-          </w:p>
-        </w:tc>
-        <w:tc>
-          <w:tcPr>
-            <w:tcW w:type="dxa" w:w="4824"/>
-            <w:shd w:fill="FFFFFF"/>
-            <w:tcMar>
-              <w:top w:w="80" w:type="dxa"/>
-              <w:bottom w:w="80" w:type="dxa"/>
-              <w:left w:w="120" w:type="dxa"/>
-              <w:right w:w="120" w:type="dxa"/>
-            </w:tcMar>
-          </w:tcPr>
-          <w:p>
-            <w:pPr>
-              <w:spacing w:before="60" w:after="60"/>
-            </w:pPr>
-            <w:r>
-              <w:rPr>
-                <w:rFonts w:ascii="Calibri" w:hAnsi="Calibri"/>
-                <w:color w:val="0F172A"/>
-                <w:sz w:val="20"/>
-              </w:rPr>
-              <w:t>Hak:</w:t>
-            </w:r>
-          </w:p>
-        </w:tc>
-      </w:tr>
-      <w:tr>
-        <w:tc>
-          <w:tcPr>
-            <w:tcW w:type="dxa" w:w="4824"/>
-            <w:shd w:fill="F8FAFC"/>
-            <w:tcMar>
-              <w:top w:w="80" w:type="dxa"/>
-              <w:bottom w:w="80" w:type="dxa"/>
-              <w:left w:w="120" w:type="dxa"/>
-              <w:right w:w="120" w:type="dxa"/>
-            </w:tcMar>
-          </w:tcPr>
-          <w:p>
-            <w:pPr>
-              <w:spacing w:before="60" w:after="60"/>
-            </w:pPr>
-            <w:r>
-              <w:rPr>
-                <w:rFonts w:ascii="Calibri" w:hAnsi="Calibri"/>
-                <w:b/>
-                <w:color w:val="1E293B"/>
-                <w:sz w:val="20"/>
-              </w:rPr>
-              <w:t>Hak Göstergesi (Bölüm Başı 2 Hak)</w:t>
-            </w:r>
-          </w:p>
-        </w:tc>
-        <w:tc>
-          <w:tcPr>
-            <w:tcW w:type="dxa" w:w="4824"/>
-            <w:shd w:fill="FFFFFF"/>
-            <w:tcMar>
-              <w:top w:w="80" w:type="dxa"/>
-              <w:bottom w:w="80" w:type="dxa"/>
-              <w:left w:w="120" w:type="dxa"/>
-              <w:right w:w="120" w:type="dxa"/>
-            </w:tcMar>
-          </w:tcPr>
-          <w:p>
-            <w:pPr>
-              <w:spacing w:before="60" w:after="60"/>
-            </w:pPr>
-            <w:r>
-              <w:rPr>
-                <w:rFonts w:ascii="Calibri" w:hAnsi="Calibri"/>
-                <w:color w:val="0F172A"/>
-                <w:sz w:val="20"/>
-              </w:rPr>
-              <w:t>❤️❤️ (2 Kırmızı Kalp / Hata durumunda kırmızı soluklaşır)</w:t>
             </w:r>
           </w:p>
         </w:tc>
@@ -2899,218 +2793,6 @@
                 <w:sz w:val="20"/>
               </w:rPr>
               <w:t>✗ DİKKAT!</w:t>
-            </w:r>
-          </w:p>
-        </w:tc>
-      </w:tr>
-      <w:tr>
-        <w:tc>
-          <w:tcPr>
-            <w:tcW w:type="dxa" w:w="4824"/>
-            <w:shd w:fill="F8FAFC"/>
-            <w:tcMar>
-              <w:top w:w="80" w:type="dxa"/>
-              <w:bottom w:w="80" w:type="dxa"/>
-              <w:left w:w="120" w:type="dxa"/>
-              <w:right w:w="120" w:type="dxa"/>
-            </w:tcMar>
-          </w:tcPr>
-          <w:p>
-            <w:pPr>
-              <w:spacing w:before="60" w:after="60"/>
-            </w:pPr>
-            <w:r>
-              <w:rPr>
-                <w:rFonts w:ascii="Calibri" w:hAnsi="Calibri"/>
-                <w:b/>
-                <w:color w:val="1E293B"/>
-                <w:sz w:val="20"/>
-              </w:rPr>
-              <w:t>2 Yanlış Hakkı Dolduğunda Alt Dönüt</w:t>
-            </w:r>
-          </w:p>
-        </w:tc>
-        <w:tc>
-          <w:tcPr>
-            <w:tcW w:type="dxa" w:w="4824"/>
-            <w:shd w:fill="FFFFFF"/>
-            <w:tcMar>
-              <w:top w:w="80" w:type="dxa"/>
-              <w:bottom w:w="80" w:type="dxa"/>
-              <w:left w:w="120" w:type="dxa"/>
-              <w:right w:w="120" w:type="dxa"/>
-            </w:tcMar>
-          </w:tcPr>
-          <w:p>
-            <w:pPr>
-              <w:spacing w:before="60" w:after="60"/>
-            </w:pPr>
-            <w:r>
-              <w:rPr>
-                <w:rFonts w:ascii="Calibri" w:hAnsi="Calibri"/>
-                <w:color w:val="0F172A"/>
-                <w:sz w:val="20"/>
-              </w:rPr>
-              <w:t>✗ 2 Yanlış Hakkınız Doldu!</w:t>
-            </w:r>
-          </w:p>
-        </w:tc>
-      </w:tr>
-      <w:tr>
-        <w:tc>
-          <w:tcPr>
-            <w:tcW w:type="dxa" w:w="4824"/>
-            <w:shd w:fill="F8FAFC"/>
-            <w:tcMar>
-              <w:top w:w="80" w:type="dxa"/>
-              <w:bottom w:w="80" w:type="dxa"/>
-              <w:left w:w="120" w:type="dxa"/>
-              <w:right w:w="120" w:type="dxa"/>
-            </w:tcMar>
-          </w:tcPr>
-          <w:p>
-            <w:pPr>
-              <w:spacing w:before="60" w:after="60"/>
-            </w:pPr>
-            <w:r>
-              <w:rPr>
-                <w:rFonts w:ascii="Calibri" w:hAnsi="Calibri"/>
-                <w:b/>
-                <w:color w:val="1E293B"/>
-                <w:sz w:val="20"/>
-              </w:rPr>
-              <w:t>2 Yanlış Modalı Başlığı</w:t>
-            </w:r>
-          </w:p>
-        </w:tc>
-        <w:tc>
-          <w:tcPr>
-            <w:tcW w:type="dxa" w:w="4824"/>
-            <w:shd w:fill="FFFFFF"/>
-            <w:tcMar>
-              <w:top w:w="80" w:type="dxa"/>
-              <w:bottom w:w="80" w:type="dxa"/>
-              <w:left w:w="120" w:type="dxa"/>
-              <w:right w:w="120" w:type="dxa"/>
-            </w:tcMar>
-          </w:tcPr>
-          <w:p>
-            <w:pPr>
-              <w:spacing w:before="60" w:after="60"/>
-            </w:pPr>
-            <w:r>
-              <w:rPr>
-                <w:rFonts w:ascii="Calibri" w:hAnsi="Calibri"/>
-                <w:color w:val="0F172A"/>
-                <w:sz w:val="20"/>
-              </w:rPr>
-              <w:t>2 Yanlış Hakkınız Doldu!</w:t>
-            </w:r>
-          </w:p>
-        </w:tc>
-      </w:tr>
-      <w:tr>
-        <w:tc>
-          <w:tcPr>
-            <w:tcW w:type="dxa" w:w="4824"/>
-            <w:shd w:fill="F8FAFC"/>
-            <w:tcMar>
-              <w:top w:w="80" w:type="dxa"/>
-              <w:bottom w:w="80" w:type="dxa"/>
-              <w:left w:w="120" w:type="dxa"/>
-              <w:right w:w="120" w:type="dxa"/>
-            </w:tcMar>
-          </w:tcPr>
-          <w:p>
-            <w:pPr>
-              <w:spacing w:before="60" w:after="60"/>
-            </w:pPr>
-            <w:r>
-              <w:rPr>
-                <w:rFonts w:ascii="Calibri" w:hAnsi="Calibri"/>
-                <w:b/>
-                <w:color w:val="1E293B"/>
-                <w:sz w:val="20"/>
-              </w:rPr>
-              <w:t>2 Yanlış Modalı Yönergesi</w:t>
-            </w:r>
-          </w:p>
-        </w:tc>
-        <w:tc>
-          <w:tcPr>
-            <w:tcW w:type="dxa" w:w="4824"/>
-            <w:shd w:fill="FFFFFF"/>
-            <w:tcMar>
-              <w:top w:w="80" w:type="dxa"/>
-              <w:bottom w:w="80" w:type="dxa"/>
-              <w:left w:w="120" w:type="dxa"/>
-              <w:right w:w="120" w:type="dxa"/>
-            </w:tcMar>
-          </w:tcPr>
-          <w:p>
-            <w:pPr>
-              <w:spacing w:before="60" w:after="60"/>
-            </w:pPr>
-            <w:r>
-              <w:rPr>
-                <w:rFonts w:ascii="Calibri" w:hAnsi="Calibri"/>
-                <w:color w:val="0F172A"/>
-                <w:sz w:val="20"/>
-              </w:rPr>
-              <w:t>Konuyu daha iyi kavramak için bu bölümün doğru cevaplarını inceleyiniz:</w:t>
-            </w:r>
-          </w:p>
-        </w:tc>
-      </w:tr>
-      <w:tr>
-        <w:tc>
-          <w:tcPr>
-            <w:tcW w:type="dxa" w:w="4824"/>
-            <w:shd w:fill="F8FAFC"/>
-            <w:tcMar>
-              <w:top w:w="80" w:type="dxa"/>
-              <w:bottom w:w="80" w:type="dxa"/>
-              <w:left w:w="120" w:type="dxa"/>
-              <w:right w:w="120" w:type="dxa"/>
-            </w:tcMar>
-          </w:tcPr>
-          <w:p>
-            <w:pPr>
-              <w:spacing w:before="60" w:after="60"/>
-            </w:pPr>
-            <w:r>
-              <w:rPr>
-                <w:rFonts w:ascii="Calibri" w:hAnsi="Calibri"/>
-                <w:b/>
-                <w:color w:val="1E293B"/>
-                <w:sz w:val="20"/>
-              </w:rPr>
-              <w:t>2 Yanlış Modalı Geçiş Butonu</w:t>
-            </w:r>
-          </w:p>
-        </w:tc>
-        <w:tc>
-          <w:tcPr>
-            <w:tcW w:type="dxa" w:w="4824"/>
-            <w:shd w:fill="FFFFFF"/>
-            <w:tcMar>
-              <w:top w:w="80" w:type="dxa"/>
-              <w:bottom w:w="80" w:type="dxa"/>
-              <w:left w:w="120" w:type="dxa"/>
-              <w:right w:w="120" w:type="dxa"/>
-            </w:tcMar>
-          </w:tcPr>
-          <w:p>
-            <w:pPr>
-              <w:spacing w:before="60" w:after="60"/>
-            </w:pPr>
-            <w:r>
-              <w:rPr>
-                <w:rFonts w:ascii="Calibri" w:hAnsi="Calibri"/>
-                <w:color w:val="0F172A"/>
-                <w:sz w:val="20"/>
-              </w:rPr>
-              <w:t>Sonraki Bölüme Geç / Sonuç Ekranına Geç</w:t>
             </w:r>
           </w:p>
         </w:tc>

</xml_diff>

<commit_message>
Giris ekranindan kazanim rozeti ve robot uzerindeki ses girdisi kapsulu kaldirildi
</commit_message>
<xml_diff>
--- a/oyunlar/YEGITEK26BTY05050610_Ekran_Yazilari.docx
+++ b/oyunlar/YEGITEK26BTY05050610_Ekran_Yazilari.docx
@@ -1621,59 +1621,6 @@
                 <w:color w:val="1E293B"/>
                 <w:sz w:val="20"/>
               </w:rPr>
-              <w:t>Kazanım Rozeti</w:t>
-            </w:r>
-          </w:p>
-        </w:tc>
-        <w:tc>
-          <w:tcPr>
-            <w:tcW w:type="dxa" w:w="4824"/>
-            <w:shd w:fill="FFFFFF"/>
-            <w:tcMar>
-              <w:top w:w="80" w:type="dxa"/>
-              <w:bottom w:w="80" w:type="dxa"/>
-              <w:left w:w="120" w:type="dxa"/>
-              <w:right w:w="120" w:type="dxa"/>
-            </w:tcMar>
-          </w:tcPr>
-          <w:p>
-            <w:pPr>
-              <w:spacing w:before="60" w:after="60"/>
-            </w:pPr>
-            <w:r>
-              <w:rPr>
-                <w:rFonts w:ascii="Calibri" w:hAnsi="Calibri"/>
-                <w:color w:val="0F172A"/>
-                <w:sz w:val="20"/>
-              </w:rPr>
-              <w:t>YEĞİTEK 6. SINIF • BTY.6.5.1 YAPAY ZEKÂ GİRDİLERİ</w:t>
-            </w:r>
-          </w:p>
-        </w:tc>
-      </w:tr>
-      <w:tr>
-        <w:tc>
-          <w:tcPr>
-            <w:tcW w:type="dxa" w:w="4824"/>
-            <w:shd w:fill="F8FAFC"/>
-            <w:tcMar>
-              <w:top w:w="80" w:type="dxa"/>
-              <w:bottom w:w="80" w:type="dxa"/>
-              <w:left w:w="120" w:type="dxa"/>
-              <w:right w:w="120" w:type="dxa"/>
-            </w:tcMar>
-          </w:tcPr>
-          <w:p>
-            <w:pPr>
-              <w:spacing w:before="60" w:after="60"/>
-            </w:pPr>
-            <w:r>
-              <w:rPr>
-                <w:rFonts w:ascii="Calibri" w:hAnsi="Calibri"/>
-                <w:b/>
-                <w:color w:val="1E293B"/>
-                <w:sz w:val="20"/>
-              </w:rPr>
               <w:t>Ekran Ana Başlığı (h2)</w:t>
             </w:r>
           </w:p>
@@ -1700,59 +1647,6 @@
                 <w:sz w:val="20"/>
               </w:rPr>
               <w:t>BİLGİBOT Girdi Avı Oyunu</w:t>
-            </w:r>
-          </w:p>
-        </w:tc>
-      </w:tr>
-      <w:tr>
-        <w:tc>
-          <w:tcPr>
-            <w:tcW w:type="dxa" w:w="4824"/>
-            <w:shd w:fill="F8FAFC"/>
-            <w:tcMar>
-              <w:top w:w="80" w:type="dxa"/>
-              <w:bottom w:w="80" w:type="dxa"/>
-              <w:left w:w="120" w:type="dxa"/>
-              <w:right w:w="120" w:type="dxa"/>
-            </w:tcMar>
-          </w:tcPr>
-          <w:p>
-            <w:pPr>
-              <w:spacing w:before="60" w:after="60"/>
-            </w:pPr>
-            <w:r>
-              <w:rPr>
-                <w:rFonts w:ascii="Calibri" w:hAnsi="Calibri"/>
-                <w:b/>
-                <w:color w:val="1E293B"/>
-                <w:sz w:val="20"/>
-              </w:rPr>
-              <w:t>İllüstrasyon İçi Örnek Kapsül Metni</w:t>
-            </w:r>
-          </w:p>
-        </w:tc>
-        <w:tc>
-          <w:tcPr>
-            <w:tcW w:type="dxa" w:w="4824"/>
-            <w:shd w:fill="FFFFFF"/>
-            <w:tcMar>
-              <w:top w:w="80" w:type="dxa"/>
-              <w:bottom w:w="80" w:type="dxa"/>
-              <w:left w:w="120" w:type="dxa"/>
-              <w:right w:w="120" w:type="dxa"/>
-            </w:tcMar>
-          </w:tcPr>
-          <w:p>
-            <w:pPr>
-              <w:spacing w:before="60" w:after="60"/>
-            </w:pPr>
-            <w:r>
-              <w:rPr>
-                <w:rFonts w:ascii="Calibri" w:hAnsi="Calibri"/>
-                <w:color w:val="0F172A"/>
-                <w:sz w:val="20"/>
-              </w:rPr>
-              <w:t>SES GİRDİSİ</w:t>
             </w:r>
           </w:p>
         </w:tc>

</xml_diff>

<commit_message>
Metin revizeleri: bolum tamamlama ve goruntu girdisi donutleri duzenlendi
</commit_message>
<xml_diff>
--- a/oyunlar/YEGITEK26BTY05050610_Ekran_Yazilari.docx
+++ b/oyunlar/YEGITEK26BTY05050610_Ekran_Yazilari.docx
@@ -2739,7 +2739,7 @@
                 <w:color w:val="0F172A"/>
                 <w:sz w:val="20"/>
               </w:rPr>
-              <w:t>Tebrikler! Bölüm Görevini Başarıyla Tamamladınız. 'İleri' butonuna basınız.</w:t>
+              <w:t>Tebrikler! Bölüm görevini başarıyla tamamladınız. "İleri" butonuna basınız.</w:t>
             </w:r>
           </w:p>
         </w:tc>
@@ -3414,7 +3414,7 @@
               </w:rPr>
               <w:t>Kart Metni: Yüz tanıma kedi/insan fotoğrafları</w:t>
               <w:br/>
-              <w:t>Yakalama Dönütü: ✓ YAKALANDI! Harika! Fotoğraf ve resimler 'Görüntü Girdisi'dir.</w:t>
+              <w:t>Yakalama Dönütü: ✓ YAKALANDI! Harika! Fotoğraf ve resimler görüntü girdisidir.</w:t>
             </w:r>
           </w:p>
         </w:tc>

</xml_diff>

<commit_message>
Noktalama revizeleri: yonergeler ve donut sonlarindaki unlem isaretleri nokta ile degistirildi
</commit_message>
<xml_diff>
--- a/oyunlar/YEGITEK26BTY05050610_Ekran_Yazilari.docx
+++ b/oyunlar/YEGITEK26BTY05050610_Ekran_Yazilari.docx
@@ -1699,7 +1699,7 @@
                 <w:color w:val="0F172A"/>
                 <w:sz w:val="20"/>
               </w:rPr>
-              <w:t>Robotunuz BİLGİBOT'u kontrol ederek doğru girdileri yakalayınız!</w:t>
+              <w:t>Robotunuz BİLGİBOT'u kontrol ederek doğru girdileri yakalayınız.</w:t>
             </w:r>
           </w:p>
         </w:tc>
@@ -1752,7 +1752,7 @@
                 <w:color w:val="0F172A"/>
                 <w:sz w:val="20"/>
               </w:rPr>
-              <w:t>1. Bölüm (Girdi Türü Avı): Hedef gösterilen girdi türünü (Metin, Ses, Görüntü, Sayısal veya Sensör) yakalayınız! Çeldirici videolardan kaçınız.</w:t>
+              <w:t>1. Bölüm (Girdi Türü Avı): Hedef gösterilen girdi türünü (Metin, Ses, Görüntü, Sayısal veya Sensör) yakalayınız. Çeldirici videolardan kaçınız.</w:t>
             </w:r>
           </w:p>
         </w:tc>
@@ -1805,7 +1805,7 @@
                 <w:color w:val="0F172A"/>
                 <w:sz w:val="20"/>
               </w:rPr>
-              <w:t>2. Bölüm (Kaliteli Girdi Avı): Net ifadeleri, doğru etiketleri ve güncel verileri yakalayarak yapay zekâ modelini eğitiniz; kusurlu verilerden kaçınız!</w:t>
+              <w:t>2. Bölüm (Kaliteli Girdi Avı): Net ifadeleri, doğru etiketleri ve güncel verileri yakalayarak yapay zekâ modelini eğitiniz; kusurlu verilerden kaçınız.</w:t>
             </w:r>
           </w:p>
         </w:tc>
@@ -1858,7 +1858,7 @@
                 <w:color w:val="0F172A"/>
                 <w:sz w:val="20"/>
               </w:rPr>
-              <w:t>3. Bölüm (Günlük Hayat Girdileri): Yemek tarifi malzemesi, navigasyon adresi, müzik geçmişi ve klavye harflerini yakalayınız!</w:t>
+              <w:t>3. Bölüm (Günlük Hayat Girdileri): Yemek tarifi malzemesi, navigasyon adresi, müzik geçmişi ve klavye harflerini yakalayınız.</w:t>
             </w:r>
           </w:p>
         </w:tc>
@@ -2779,7 +2779,7 @@
           <w:color w:val="2563EB"/>
           <w:sz w:val="26"/>
         </w:rPr>
-        <w:t>1.1. Görev: HEDEF: SES GİRDİSİ — Mikrofon ile kaydedilen sesi yakalayınız!</w:t>
+        <w:t>1.1. Görev: HEDEF: SES GİRDİSİ — Mikrofon ile kaydedilen sesi yakalayınız.</w:t>
       </w:r>
     </w:p>
     <w:tbl>
@@ -2947,7 +2947,7 @@
                 <w:color w:val="0F172A"/>
                 <w:sz w:val="20"/>
               </w:rPr>
-              <w:t>— Mikrofon ile kaydedilen sesi yakalayınız!</w:t>
+              <w:t>— Mikrofon ile kaydedilen sesi yakalayınız.</w:t>
             </w:r>
           </w:p>
         </w:tc>
@@ -3057,7 +3057,7 @@
               </w:rPr>
               <w:t>Kart Metni: Kedi ve yüz fotoğrafları</w:t>
               <w:br/>
-              <w:t>Hata Dönütü: ✗ DİKKAT! Bu görüntü girdisidir, ses girdisi yakalayınız!</w:t>
+              <w:t>Hata Dönütü: ✗ DİKKAT! Bu görüntü girdisidir, ses girdisi yakalayınız.</w:t>
             </w:r>
           </w:p>
         </w:tc>
@@ -3112,7 +3112,7 @@
               </w:rPr>
               <w:t>Kart Metni: Sıcaklık nem ölçümü (24°C)</w:t>
               <w:br/>
-              <w:t>Hata Dönütü: ✗ DİKKAT! Bu sayısal veridir, ses girdisi yakalayınız!</w:t>
+              <w:t>Hata Dönütü: ✗ DİKKAT! Bu sayısal veridir, ses girdisi yakalayınız.</w:t>
             </w:r>
           </w:p>
         </w:tc>
@@ -3191,7 +3191,7 @@
           <w:color w:val="2563EB"/>
           <w:sz w:val="26"/>
         </w:rPr>
-        <w:t>1.2. Görev: HEDEF: GÖRÜNTÜ GİRDİSİ — Yüz tanıma ve fotoğrafları yakalayınız!</w:t>
+        <w:t>1.2. Görev: HEDEF: GÖRÜNTÜ GİRDİSİ — Yüz tanıma ve fotoğrafları yakalayınız.</w:t>
       </w:r>
     </w:p>
     <w:tbl>
@@ -3359,7 +3359,7 @@
                 <w:color w:val="0F172A"/>
                 <w:sz w:val="20"/>
               </w:rPr>
-              <w:t>— Yüz tanıma ve fotoğrafları yakalayınız!</w:t>
+              <w:t>— Yüz tanıma ve fotoğrafları yakalayınız.</w:t>
             </w:r>
           </w:p>
         </w:tc>
@@ -3469,7 +3469,7 @@
               </w:rPr>
               <w:t>Kart Metni: Klavyeyle yazılan soru metni</w:t>
               <w:br/>
-              <w:t>Hata Dönütü: ✗ DİKKAT! Bu metin girdisidir, görüntü girdisi yakalayınız!</w:t>
+              <w:t>Hata Dönütü: ✗ DİKKAT! Bu metin girdisidir, görüntü girdisi yakalayınız.</w:t>
             </w:r>
           </w:p>
         </w:tc>
@@ -3524,7 +3524,7 @@
               </w:rPr>
               <w:t>Kart Metni: Akıllı saat kalp atış hızı</w:t>
               <w:br/>
-              <w:t>Hata Dönütü: ✗ DİKKAT! Bu sensör verisidir, görüntü girdisi yakalayınız!</w:t>
+              <w:t>Hata Dönütü: ✗ DİKKAT! Bu sensör verisidir, görüntü girdisi yakalayınız.</w:t>
             </w:r>
           </w:p>
         </w:tc>
@@ -3548,7 +3548,7 @@
           <w:color w:val="2563EB"/>
           <w:sz w:val="26"/>
         </w:rPr>
-        <w:t>1.3. Görev: HEDEF: METİN GİRDİSİ — Klavyeyle yazılan kelime ve cümleleri yakalayınız!</w:t>
+        <w:t>1.3. Görev: HEDEF: METİN GİRDİSİ — Klavyeyle yazılan kelime ve cümleleri yakalayınız.</w:t>
       </w:r>
     </w:p>
     <w:tbl>
@@ -3716,7 +3716,7 @@
                 <w:color w:val="0F172A"/>
                 <w:sz w:val="20"/>
               </w:rPr>
-              <w:t>— Klavyeyle yazılan kelime ve cümleleri yakalayınız!</w:t>
+              <w:t>— Klavyeyle yazılan kelime ve cümleleri yakalayınız.</w:t>
             </w:r>
           </w:p>
         </w:tc>
@@ -3826,7 +3826,7 @@
               </w:rPr>
               <w:t>Kart Metni: Sesli asistana sesli komut</w:t>
               <w:br/>
-              <w:t>Hata Dönütü: ✗ DİKKAT! Bu ses girdisidir, metin girdisi yakalayınız!</w:t>
+              <w:t>Hata Dönütü: ✗ DİKKAT! Bu ses girdisidir, metin girdisi yakalayınız.</w:t>
             </w:r>
           </w:p>
         </w:tc>
@@ -3881,7 +3881,7 @@
               </w:rPr>
               <w:t>Kart Metni: Sıcaklık ve nem değerleri</w:t>
               <w:br/>
-              <w:t>Hata Dönütü: ✗ DİKKAT! Bu sayısal veridir, metin girdisi yakalayınız!</w:t>
+              <w:t>Hata Dönütü: ✗ DİKKAT! Bu sayısal veridir, metin girdisi yakalayınız.</w:t>
             </w:r>
           </w:p>
         </w:tc>
@@ -3905,7 +3905,7 @@
           <w:color w:val="2563EB"/>
           <w:sz w:val="26"/>
         </w:rPr>
-        <w:t>1.4. Görev: HEDEF: SAYISAL VERİ GİRDİSİ — Hava tahmini sıcaklık ve nem ölçümlerini yakalayınız!</w:t>
+        <w:t>1.4. Görev: HEDEF: SAYISAL VERİ GİRDİSİ — Hava tahmini sıcaklık ve nem ölçümlerini yakalayınız.</w:t>
       </w:r>
     </w:p>
     <w:tbl>
@@ -4073,7 +4073,7 @@
                 <w:color w:val="0F172A"/>
                 <w:sz w:val="20"/>
               </w:rPr>
-              <w:t>— Hava tahmini sıcaklık ve nem ölçümlerini yakalayınız!</w:t>
+              <w:t>— Hava tahmini sıcaklık ve nem ölçümlerini yakalayınız.</w:t>
             </w:r>
           </w:p>
         </w:tc>
@@ -4183,7 +4183,7 @@
               </w:rPr>
               <w:t>Kart Metni: Yüz tanıma kedi resmi</w:t>
               <w:br/>
-              <w:t>Hata Dönütü: ✗ DİKKAT! Bu görüntü girdisidir, sayısal veri yakalayınız!</w:t>
+              <w:t>Hata Dönütü: ✗ DİKKAT! Bu görüntü girdisidir, sayısal veri yakalayınız.</w:t>
             </w:r>
           </w:p>
         </w:tc>
@@ -4238,7 +4238,7 @@
               </w:rPr>
               <w:t>Kart Metni: Klavyeyle yazılan cümle</w:t>
               <w:br/>
-              <w:t>Hata Dönütü: ✗ DİKKAT! Bu metin girdisidir, sayısal veri yakalayınız!</w:t>
+              <w:t>Hata Dönütü: ✗ DİKKAT! Bu metin girdisidir, sayısal veri yakalayınız.</w:t>
             </w:r>
           </w:p>
         </w:tc>
@@ -4262,7 +4262,7 @@
           <w:color w:val="2563EB"/>
           <w:sz w:val="26"/>
         </w:rPr>
-        <w:t>1.5. Görev: HEDEF: SENSÖR VERİSİ — Akıllı saat adım ve nabız ölçümünü yakalayınız!</w:t>
+        <w:t>1.5. Görev: HEDEF: SENSÖR VERİSİ — Akıllı saat adım ve nabız ölçümünü yakalayınız.</w:t>
       </w:r>
     </w:p>
     <w:tbl>
@@ -4430,7 +4430,7 @@
                 <w:color w:val="0F172A"/>
                 <w:sz w:val="20"/>
               </w:rPr>
-              <w:t>— Akıllı saat adım ve nabız ölçümünü yakalayınız!</w:t>
+              <w:t>— Akıllı saat adım ve nabız ölçümünü yakalayınız.</w:t>
             </w:r>
           </w:p>
         </w:tc>
@@ -4540,7 +4540,7 @@
               </w:rPr>
               <w:t>Kart Metni: Sesli asistana söylenen ses</w:t>
               <w:br/>
-              <w:t>Hata Dönütü: ✗ DİKKAT! Bu ses girdisidir, sensör verisi yakalayınız!</w:t>
+              <w:t>Hata Dönütü: ✗ DİKKAT! Bu ses girdisidir, sensör verisi yakalayınız.</w:t>
             </w:r>
           </w:p>
         </w:tc>
@@ -4787,7 +4787,7 @@
                 <w:color w:val="0F172A"/>
                 <w:sz w:val="20"/>
               </w:rPr>
-              <w:t>— Net ifadeleri, doğru etiketleri ve güncel verileri yakalayınız!</w:t>
+              <w:t>— Net ifadeleri, doğru etiketleri ve güncel verileri yakalayınız.</w:t>
             </w:r>
           </w:p>
         </w:tc>
@@ -4912,7 +4912,7 @@
               </w:rPr>
               <w:t>Kapsül Metni: Komut: "Gelecek cumartesi saat 17.00'de bize gel."</w:t>
               <w:br/>
-              <w:t>Dönüt: ✓ YAKALANDI! Net İfade: Açık ve net komutlar modeli doğru eğitir!</w:t>
+              <w:t>Dönüt: ✓ YAKALANDI! Net İfade: Açık ve net komutlar modeli doğru eğitir.</w:t>
             </w:r>
           </w:p>
         </w:tc>
@@ -4967,7 +4967,7 @@
               </w:rPr>
               <w:t>Kapsül Metni: Komut: "Bu cumartesi el."</w:t>
               <w:br/>
-              <w:t>Dönüt: ✗ DİKKAT! Kusurlu Girdi! Muğlak ve anlaşılmaz ifadelerden kaçınınız!</w:t>
+              <w:t>Dönüt: ✗ DİKKAT! Kusurlu Girdi! Muğlak ve anlaşılmaz ifadelerden kaçınınız.</w:t>
             </w:r>
           </w:p>
         </w:tc>
@@ -5077,7 +5077,7 @@
               </w:rPr>
               <w:t>Kapsül Metni: Kedi fotoğrafına "Köpek" etiketi basmak</w:t>
               <w:br/>
-              <w:t>Dönüt: ✗ DİKKAT! Hatalı Etiketleme! Kediye köpek derseniz yapay zekâ yanılır!</w:t>
+              <w:t>Dönüt: ✗ DİKKAT! Hatalı Etiketleme! Kediye köpek derseniz yapay zekâ yanılır.</w:t>
             </w:r>
           </w:p>
         </w:tc>
@@ -5187,7 +5187,7 @@
               </w:rPr>
               <w:t>Kapsül Metni: Yalnızca tek bir sokaktaki beyaz kediler</w:t>
               <w:br/>
-              <w:t>Dönüt: ✗ DİKKAT! Kısıtlı Kaynak! Model diğer kedi türlerini tanıyamaz!</w:t>
+              <w:t>Dönüt: ✗ DİKKAT! Kısıtlı Kaynak! Model diğer kedi türlerini tanıyamaz.</w:t>
             </w:r>
           </w:p>
         </w:tc>
@@ -5297,7 +5297,7 @@
               </w:rPr>
               <w:t>Kapsül Metni: 10 yıl öncesinin eski hava verisi</w:t>
               <w:br/>
-              <w:t>Dönüt: ✗ DİKKAT! Eski Veri! Güncel olmayan verileri yakalamayınız!</w:t>
+              <w:t>Dönüt: ✗ DİKKAT! Eski Veri! Güncel olmayan verileri yakalamayınız.</w:t>
             </w:r>
           </w:p>
         </w:tc>
@@ -5392,7 +5392,7 @@
           <w:color w:val="2563EB"/>
           <w:sz w:val="26"/>
         </w:rPr>
-        <w:t>3.1. Görev: HEDEF: YEMEK TARİFİ İÇİN GİRDİ — Yemek tarifindeki doğru malzemeleri yakalayınız!</w:t>
+        <w:t>3.1. Görev: HEDEF: YEMEK TARİFİ İÇİN GİRDİ — Yemek tarifindeki doğru malzemeleri yakalayınız.</w:t>
       </w:r>
     </w:p>
     <w:tbl>
@@ -5560,7 +5560,7 @@
                 <w:color w:val="0F172A"/>
                 <w:sz w:val="20"/>
               </w:rPr>
-              <w:t>— Yemek tarifindeki doğru malzemeleri yakalayınız!</w:t>
+              <w:t>— Yemek tarifindeki doğru malzemeleri yakalayınız.</w:t>
             </w:r>
           </w:p>
         </w:tc>
@@ -5615,7 +5615,7 @@
               </w:rPr>
               <w:t>Kart Metni: Yemeğin kendine özgü doğru malzemeleri</w:t>
               <w:br/>
-              <w:t>Yakalama Dönütü: ✓ YAKALANDI! Yemek tarifinde malzemeler, yapay zekâda ise girdiler vardır!</w:t>
+              <w:t>Yakalama Dönütü: ✓ YAKALANDI! Yemek tarifinde malzemeler, yapay zekâda ise girdiler vardır.</w:t>
             </w:r>
           </w:p>
         </w:tc>
@@ -5670,7 +5670,7 @@
               </w:rPr>
               <w:t>Kart Metni: Harfler ve heceler</w:t>
               <w:br/>
-              <w:t>Hata Dönütü: ✗ DİKKAT! Bu klavye girdisidir, yemek malzemesini yakalayınız!</w:t>
+              <w:t>Hata Dönütü: ✗ DİKKAT! Bu klavye girdisidir, yemek malzemesini yakalayınız.</w:t>
             </w:r>
           </w:p>
         </w:tc>
@@ -5725,7 +5725,7 @@
               </w:rPr>
               <w:t>Kart Metni: Eski dinleme listesi</w:t>
               <w:br/>
-              <w:t>Hata Dönütü: ✗ DİKKAT! Bu müzik girdisidir, yemek malzemesini yakalayınız!</w:t>
+              <w:t>Hata Dönütü: ✗ DİKKAT! Bu müzik girdisidir, yemek malzemesini yakalayınız.</w:t>
             </w:r>
           </w:p>
         </w:tc>
@@ -5749,7 +5749,7 @@
           <w:color w:val="2563EB"/>
           <w:sz w:val="26"/>
         </w:rPr>
-        <w:t>3.2. Görev: HEDEF: NAVİGASYON İÇİN GİRDİ — Doğru ev adresini ve konumu yakalayınız!</w:t>
+        <w:t>3.2. Görev: HEDEF: NAVİGASYON İÇİN GİRDİ — Doğru ev adresini ve konumu yakalayınız.</w:t>
       </w:r>
     </w:p>
     <w:tbl>
@@ -5917,7 +5917,7 @@
                 <w:color w:val="0F172A"/>
                 <w:sz w:val="20"/>
               </w:rPr>
-              <w:t>— Doğru ev adresini ve konumu yakalayınız!</w:t>
+              <w:t>— Doğru ev adresini ve konumu yakalayınız.</w:t>
             </w:r>
           </w:p>
         </w:tc>
@@ -5972,7 +5972,7 @@
               </w:rPr>
               <w:t>Kart Metni: Doğru ev adresi ve konum bilgisi</w:t>
               <w:br/>
-              <w:t>Yakalama Dönütü: ✓ YAKALANDI! Doğru adres girilirse navigasyon hedefe ulaştırır!</w:t>
+              <w:t>Yakalama Dönütü: ✓ YAKALANDI! Doğru adres girilirse navigasyon hedefe ulaştırır.</w:t>
             </w:r>
           </w:p>
         </w:tc>
@@ -6027,7 +6027,7 @@
               </w:rPr>
               <w:t>Kart Metni: Tencereye atılan tuz</w:t>
               <w:br/>
-              <w:t>Hata Dönütü: ✗ DİKKAT! Bu yemek girdisidir, adres bilgisini yakalayınız!</w:t>
+              <w:t>Hata Dönütü: ✗ DİKKAT! Bu yemek girdisidir, adres bilgisini yakalayınız.</w:t>
             </w:r>
           </w:p>
         </w:tc>
@@ -6082,7 +6082,7 @@
               </w:rPr>
               <w:t>Kart Metni: Yazılan kelime harfleri</w:t>
               <w:br/>
-              <w:t>Hata Dönütü: ✗ DİKKAT! Bu klavye girdisidir, konum girdisini yakalayınız!</w:t>
+              <w:t>Hata Dönütü: ✗ DİKKAT! Bu klavye girdisidir, konum girdisini yakalayınız.</w:t>
             </w:r>
           </w:p>
         </w:tc>
@@ -6106,7 +6106,7 @@
           <w:color w:val="2563EB"/>
           <w:sz w:val="26"/>
         </w:rPr>
-        <w:t>3.3. Görev: HEDEF: MÜZİK ÖNERİSİ İÇİN GİRDİ — Dinlediğiniz şarkı geçmişini yakalayınız!</w:t>
+        <w:t>3.3. Görev: HEDEF: MÜZİK ÖNERİSİ İÇİN GİRDİ — Dinlediğiniz şarkı geçmişini yakalayınız.</w:t>
       </w:r>
     </w:p>
     <w:tbl>
@@ -6274,7 +6274,7 @@
                 <w:color w:val="0F172A"/>
                 <w:sz w:val="20"/>
               </w:rPr>
-              <w:t>— Dinlediğiniz şarkı geçmişini yakalayınız!</w:t>
+              <w:t>— Dinlediğiniz şarkı geçmişini yakalayınız.</w:t>
             </w:r>
           </w:p>
         </w:tc>
@@ -6329,7 +6329,7 @@
               </w:rPr>
               <w:t>Kart Metni: Uygulamada dinlediğiniz şarkı geçmişi</w:t>
               <w:br/>
-              <w:t>Yakalama Dönütü: ✓ YAKALANDI! Ne kadar çok müzik dinlerseniz yapay zekâ o kadar öğrenir!</w:t>
+              <w:t>Yakalama Dönütü: ✓ YAKALANDI! Ne kadar çok müzik dinlerseniz yapay zekâ o kadar öğrenir.</w:t>
             </w:r>
           </w:p>
         </w:tc>
@@ -6384,7 +6384,7 @@
               </w:rPr>
               <w:t>Kart Metni: Ev adresi konumu</w:t>
               <w:br/>
-              <w:t>Hata Dönütü: ✗ DİKKAT! Bu navigasyon girdisidir, dinlenen şarkıları yakalayınız!</w:t>
+              <w:t>Hata Dönütü: ✗ DİKKAT! Bu navigasyon girdisidir, dinlenen şarkıları yakalayınız.</w:t>
             </w:r>
           </w:p>
         </w:tc>
@@ -6439,7 +6439,7 @@
               </w:rPr>
               <w:t>Kart Metni: Yemek tuzu ve biberi</w:t>
               <w:br/>
-              <w:t>Hata Dönütü: ✗ DİKKAT! Bu yemek girdisidir, müzik geçmişini yakalayınız!</w:t>
+              <w:t>Hata Dönütü: ✗ DİKKAT! Bu yemek girdisidir, müzik geçmişini yakalayınız.</w:t>
             </w:r>
           </w:p>
         </w:tc>
@@ -6463,7 +6463,7 @@
           <w:color w:val="2563EB"/>
           <w:sz w:val="26"/>
         </w:rPr>
-        <w:t>3.4. Görev: HEDEF: OTOMATİK DÜZELTME İÇİN GİRDİ — Klavyede basılan harfleri yakalayınız!</w:t>
+        <w:t>3.4. Görev: HEDEF: OTOMATİK DÜZELTME İÇİN GİRDİ — Klavyede basılan harfleri yakalayınız.</w:t>
       </w:r>
     </w:p>
     <w:tbl>
@@ -6631,7 +6631,7 @@
                 <w:color w:val="0F172A"/>
                 <w:sz w:val="20"/>
               </w:rPr>
-              <w:t>— Klavyede basılan harfleri yakalayınız!</w:t>
+              <w:t>— Klavyede basılan harfleri yakalayınız.</w:t>
             </w:r>
           </w:p>
         </w:tc>
@@ -6686,7 +6686,7 @@
               </w:rPr>
               <w:t>Kart Metni: Klavyede yazılan harfler ve heceler</w:t>
               <w:br/>
-              <w:t>Yakalama Dönütü: ✓ YAKALANDI! Otomatik düzeltme harfleri girdi alır ve kelimeyi tahmin eder!</w:t>
+              <w:t>Yakalama Dönütü: ✓ YAKALANDI! Otomatik düzeltme harfleri girdi alır ve kelimeyi tahmin eder.</w:t>
             </w:r>
           </w:p>
         </w:tc>
@@ -6741,7 +6741,7 @@
               </w:rPr>
               <w:t>Kart Metni: Sevilen müzik listesi</w:t>
               <w:br/>
-              <w:t>Hata Dönütü: ✗ DİKKAT! Bu müzik girdisidir, harfleri yakalayınız!</w:t>
+              <w:t>Hata Dönütü: ✗ DİKKAT! Bu müzik girdisidir, harfleri yakalayınız.</w:t>
             </w:r>
           </w:p>
         </w:tc>
@@ -6796,7 +6796,7 @@
               </w:rPr>
               <w:t>Kart Metni: Yol adresi</w:t>
               <w:br/>
-              <w:t>Hata Dönütü: ✗ DİKKAT! Bu navigasyon girdisidir, klavye harflerini yakalayınız!</w:t>
+              <w:t>Hata Dönütü: ✗ DİKKAT! Bu navigasyon girdisidir, klavye harflerini yakalayınız.</w:t>
             </w:r>
           </w:p>
         </w:tc>

</xml_diff>

<commit_message>
Kademe etiketi sadelestirildi: Bolum 1, Bolum 2, Bolum 3 olarak guncellendi
</commit_message>
<xml_diff>
--- a/oyunlar/YEGITEK26BTY05050610_Ekran_Yazilari.docx
+++ b/oyunlar/YEGITEK26BTY05050610_Ekran_Yazilari.docx
@@ -2103,7 +2103,7 @@
                 <w:color w:val="0F172A"/>
                 <w:sz w:val="20"/>
               </w:rPr>
-              <w:t>Bölüm 3-1 (1 / 3)</w:t>
+              <w:t>Bölüm 1</w:t>
             </w:r>
           </w:p>
         </w:tc>
@@ -2156,7 +2156,7 @@
                 <w:color w:val="0F172A"/>
                 <w:sz w:val="20"/>
               </w:rPr>
-              <w:t>Bölüm 3-2 (2 / 3)</w:t>
+              <w:t>Bölüm 2</w:t>
             </w:r>
           </w:p>
         </w:tc>
@@ -2209,7 +2209,7 @@
                 <w:color w:val="0F172A"/>
                 <w:sz w:val="20"/>
               </w:rPr>
-              <w:t>Bölüm 3-3 (3 / 3)</w:t>
+              <w:t>Bölüm 3</w:t>
             </w:r>
           </w:p>
         </w:tc>

</xml_diff>